<commit_message>
Add native powder evolutions and survival acquisition routes
</commit_message>
<xml_diff>
--- a/EntityBattle整合包生物属性表.docx
+++ b/EntityBattle整合包生物属性表.docx
@@ -82,6 +82,2099 @@
         <w:pStyle w:val="Heading1"/>
       </w:pPr>
       <w:r>
+        <w:t>转化粉与生存获取</w:t>
+      </w:r>
+    </w:p>
+    <w:p>
+      <w:r>
+        <w:t>作者为 RunWater1。普通僵尸现可捕捉，捕获率为180。转换器可用两份紫水晶碎片、两份红石和一份铁锭合成；整合包可按配方标识覆盖。捕捉并培养来源宝可梦，放出后用一份暮色转化粉右击，再在原生队伍详情确认进化。下表是本模组新增路线。</w:t>
+      </w:r>
+    </w:p>
+    <w:p>
+      <w:r>
+        <w:t>原生进化保留等级、个体值、努力值、性格、昵称、主人、精灵球、携带物与已学招式，使用结果物种的属性、特性与模型。不附赠随从装备，不继承旧世界死亡身份。正式首领仍需整场胜利；谜题羊仍须羊毛任务领奖。召唤类生物有的已有原作获取途径，本表补充稳定培养路线。详细修改方法见项目中文生存获取说明。</w:t>
+      </w:r>
+    </w:p>
+    <w:tbl>
+      <w:tblPr>
+        <w:tblW w:type="auto" w:w="0"/>
+        <w:jc w:val="center"/>
+        <w:tblLayout w:type="fixed"/>
+        <w:tblLook w:firstColumn="1" w:firstRow="1" w:lastColumn="0" w:lastRow="0" w:noHBand="0" w:noVBand="1" w:val="04A0"/>
+        <w:tblBorders>
+          <w:top w:val="single" w:sz="4" w:color="D9D9D9"/>
+          <w:left w:val="single" w:sz="4" w:color="D9D9D9"/>
+          <w:bottom w:val="single" w:sz="4" w:color="D9D9D9"/>
+          <w:right w:val="single" w:sz="4" w:color="D9D9D9"/>
+          <w:insideH w:val="single" w:sz="4" w:color="D9D9D9"/>
+          <w:insideV w:val="single" w:sz="4" w:color="D9D9D9"/>
+        </w:tblBorders>
+      </w:tblPr>
+      <w:tblGrid>
+        <w:gridCol w:w="2438"/>
+        <w:gridCol w:w="2438"/>
+        <w:gridCol w:w="1361"/>
+        <w:gridCol w:w="9184"/>
+      </w:tblGrid>
+      <w:tr>
+        <w:trPr>
+          <w:tblHeader/>
+        </w:trPr>
+        <w:tc>
+          <w:tcPr>
+            <w:tcW w:type="dxa" w:w="2438"/>
+            <w:vAlign w:val="center"/>
+            <w:tcMar>
+              <w:top w:w="50" w:type="dxa"/>
+              <w:bottom w:w="50" w:type="dxa"/>
+              <w:start w:w="90" w:type="dxa"/>
+              <w:end w:w="90" w:type="dxa"/>
+            </w:tcMar>
+            <w:shd w:fill="27566F"/>
+          </w:tcPr>
+          <w:p>
+            <w:pPr>
+              <w:spacing w:after="0" w:line="240" w:lineRule="auto"/>
+              <w:jc w:val="left"/>
+            </w:pPr>
+            <w:r>
+              <w:rPr>
+                <w:rFonts w:ascii="Microsoft YaHei" w:hAnsi="Microsoft YaHei" w:eastAsia="Microsoft YaHei"/>
+                <w:b/>
+                <w:color w:val="FFFFFF"/>
+                <w:sz w:val="17"/>
+              </w:rPr>
+            </w:r>
+            <w:r>
+              <w:rPr>
+                <w:rFonts w:ascii="Microsoft YaHei" w:hAnsi="Microsoft YaHei" w:eastAsia="Microsoft YaHei"/>
+                <w:b/>
+                <w:color w:val="FFFFFF"/>
+                <w:sz w:val="17"/>
+              </w:rPr>
+              <w:t>来源宝可梦</w:t>
+            </w:r>
+          </w:p>
+        </w:tc>
+        <w:tc>
+          <w:tcPr>
+            <w:tcW w:type="dxa" w:w="2438"/>
+            <w:vAlign w:val="center"/>
+            <w:tcMar>
+              <w:top w:w="50" w:type="dxa"/>
+              <w:bottom w:w="50" w:type="dxa"/>
+              <w:start w:w="90" w:type="dxa"/>
+              <w:end w:w="90" w:type="dxa"/>
+            </w:tcMar>
+            <w:shd w:fill="27566F"/>
+          </w:tcPr>
+          <w:p>
+            <w:pPr>
+              <w:spacing w:after="0" w:line="240" w:lineRule="auto"/>
+              <w:jc w:val="left"/>
+            </w:pPr>
+            <w:r>
+              <w:rPr>
+                <w:rFonts w:ascii="Microsoft YaHei" w:hAnsi="Microsoft YaHei" w:eastAsia="Microsoft YaHei"/>
+                <w:b/>
+                <w:color w:val="FFFFFF"/>
+                <w:sz w:val="17"/>
+              </w:rPr>
+            </w:r>
+            <w:r>
+              <w:rPr>
+                <w:rFonts w:ascii="Microsoft YaHei" w:hAnsi="Microsoft YaHei" w:eastAsia="Microsoft YaHei"/>
+                <w:b/>
+                <w:color w:val="FFFFFF"/>
+                <w:sz w:val="17"/>
+              </w:rPr>
+              <w:t>进化结果</w:t>
+            </w:r>
+          </w:p>
+        </w:tc>
+        <w:tc>
+          <w:tcPr>
+            <w:tcW w:type="dxa" w:w="1361"/>
+            <w:vAlign w:val="center"/>
+            <w:tcMar>
+              <w:top w:w="50" w:type="dxa"/>
+              <w:bottom w:w="50" w:type="dxa"/>
+              <w:start w:w="90" w:type="dxa"/>
+              <w:end w:w="90" w:type="dxa"/>
+            </w:tcMar>
+            <w:shd w:fill="27566F"/>
+          </w:tcPr>
+          <w:p>
+            <w:pPr>
+              <w:spacing w:after="0" w:line="240" w:lineRule="auto"/>
+              <w:jc w:val="left"/>
+            </w:pPr>
+            <w:r>
+              <w:rPr>
+                <w:rFonts w:ascii="Microsoft YaHei" w:hAnsi="Microsoft YaHei" w:eastAsia="Microsoft YaHei"/>
+                <w:b/>
+                <w:color w:val="FFFFFF"/>
+                <w:sz w:val="17"/>
+              </w:rPr>
+            </w:r>
+            <w:r>
+              <w:rPr>
+                <w:rFonts w:ascii="Microsoft YaHei" w:hAnsi="Microsoft YaHei" w:eastAsia="Microsoft YaHei"/>
+                <w:b/>
+                <w:color w:val="FFFFFF"/>
+                <w:sz w:val="17"/>
+              </w:rPr>
+              <w:t>最低等级</w:t>
+            </w:r>
+          </w:p>
+        </w:tc>
+        <w:tc>
+          <w:tcPr>
+            <w:tcW w:type="dxa" w:w="9184"/>
+            <w:vAlign w:val="center"/>
+            <w:tcMar>
+              <w:top w:w="50" w:type="dxa"/>
+              <w:bottom w:w="50" w:type="dxa"/>
+              <w:start w:w="90" w:type="dxa"/>
+              <w:end w:w="90" w:type="dxa"/>
+            </w:tcMar>
+            <w:shd w:fill="27566F"/>
+          </w:tcPr>
+          <w:p>
+            <w:pPr>
+              <w:spacing w:after="0" w:line="240" w:lineRule="auto"/>
+              <w:jc w:val="left"/>
+            </w:pPr>
+            <w:r>
+              <w:rPr>
+                <w:rFonts w:ascii="Microsoft YaHei" w:hAnsi="Microsoft YaHei" w:eastAsia="Microsoft YaHei"/>
+                <w:b/>
+                <w:color w:val="FFFFFF"/>
+                <w:sz w:val="17"/>
+              </w:rPr>
+            </w:r>
+            <w:r>
+              <w:rPr>
+                <w:rFonts w:ascii="Microsoft YaHei" w:hAnsi="Microsoft YaHei" w:eastAsia="Microsoft YaHei"/>
+                <w:b/>
+                <w:color w:val="FFFFFF"/>
+                <w:sz w:val="17"/>
+              </w:rPr>
+              <w:t>补充原因</w:t>
+            </w:r>
+          </w:p>
+        </w:tc>
+      </w:tr>
+      <w:tr>
+        <w:trPr>
+          <w:cantSplit/>
+        </w:trPr>
+        <w:tc>
+          <w:tcPr>
+            <w:tcW w:type="dxa" w:w="2438"/>
+            <w:vAlign w:val="center"/>
+            <w:tcMar>
+              <w:top w:w="50" w:type="dxa"/>
+              <w:bottom w:w="50" w:type="dxa"/>
+              <w:start w:w="90" w:type="dxa"/>
+              <w:end w:w="90" w:type="dxa"/>
+            </w:tcMar>
+          </w:tcPr>
+          <w:p>
+            <w:pPr>
+              <w:spacing w:after="0" w:line="240" w:lineRule="auto"/>
+              <w:jc w:val="left"/>
+            </w:pPr>
+            <w:r/>
+            <w:r>
+              <w:rPr>
+                <w:rFonts w:ascii="Microsoft YaHei" w:hAnsi="Microsoft YaHei" w:eastAsia="Microsoft YaHei"/>
+                <w:b w:val="0"/>
+                <w:color w:val="000000"/>
+                <w:sz w:val="17"/>
+              </w:rPr>
+              <w:t>僵尸</w:t>
+            </w:r>
+          </w:p>
+        </w:tc>
+        <w:tc>
+          <w:tcPr>
+            <w:tcW w:type="dxa" w:w="2438"/>
+            <w:vAlign w:val="center"/>
+            <w:tcMar>
+              <w:top w:w="50" w:type="dxa"/>
+              <w:bottom w:w="50" w:type="dxa"/>
+              <w:start w:w="90" w:type="dxa"/>
+              <w:end w:w="90" w:type="dxa"/>
+            </w:tcMar>
+          </w:tcPr>
+          <w:p>
+            <w:pPr>
+              <w:spacing w:after="0" w:line="240" w:lineRule="auto"/>
+              <w:jc w:val="left"/>
+            </w:pPr>
+            <w:r/>
+            <w:r>
+              <w:rPr>
+                <w:rFonts w:ascii="Microsoft YaHei" w:hAnsi="Microsoft YaHei" w:eastAsia="Microsoft YaHei"/>
+                <w:b w:val="0"/>
+                <w:color w:val="000000"/>
+                <w:sz w:val="17"/>
+              </w:rPr>
+              <w:t>巫妖仆从</w:t>
+            </w:r>
+          </w:p>
+        </w:tc>
+        <w:tc>
+          <w:tcPr>
+            <w:tcW w:type="dxa" w:w="1361"/>
+            <w:vAlign w:val="center"/>
+            <w:tcMar>
+              <w:top w:w="50" w:type="dxa"/>
+              <w:bottom w:w="50" w:type="dxa"/>
+              <w:start w:w="90" w:type="dxa"/>
+              <w:end w:w="90" w:type="dxa"/>
+            </w:tcMar>
+          </w:tcPr>
+          <w:p>
+            <w:pPr>
+              <w:spacing w:after="0" w:line="240" w:lineRule="auto"/>
+              <w:jc w:val="left"/>
+            </w:pPr>
+            <w:r/>
+            <w:r>
+              <w:rPr>
+                <w:rFonts w:ascii="Microsoft YaHei" w:hAnsi="Microsoft YaHei" w:eastAsia="Microsoft YaHei"/>
+                <w:b w:val="0"/>
+                <w:color w:val="000000"/>
+                <w:sz w:val="17"/>
+              </w:rPr>
+              <w:t>28</w:t>
+            </w:r>
+          </w:p>
+        </w:tc>
+        <w:tc>
+          <w:tcPr>
+            <w:tcW w:type="dxa" w:w="9184"/>
+            <w:vAlign w:val="center"/>
+            <w:tcMar>
+              <w:top w:w="50" w:type="dxa"/>
+              <w:bottom w:w="50" w:type="dxa"/>
+              <w:start w:w="90" w:type="dxa"/>
+              <w:end w:w="90" w:type="dxa"/>
+            </w:tcMar>
+          </w:tcPr>
+          <w:p>
+            <w:pPr>
+              <w:spacing w:after="0" w:line="240" w:lineRule="auto"/>
+              <w:jc w:val="left"/>
+            </w:pPr>
+            <w:r/>
+            <w:r>
+              <w:rPr>
+                <w:rFonts w:ascii="Microsoft YaHei" w:hAnsi="Microsoft YaHei" w:eastAsia="Microsoft YaHei"/>
+                <w:b w:val="0"/>
+                <w:color w:val="000000"/>
+                <w:sz w:val="17"/>
+              </w:rPr>
+              <w:t>首领召唤的随从；临时群战个体不可捕捉</w:t>
+            </w:r>
+          </w:p>
+        </w:tc>
+      </w:tr>
+      <w:tr>
+        <w:trPr>
+          <w:cantSplit/>
+        </w:trPr>
+        <w:tc>
+          <w:tcPr>
+            <w:tcW w:type="dxa" w:w="2438"/>
+            <w:vAlign w:val="center"/>
+            <w:tcMar>
+              <w:top w:w="50" w:type="dxa"/>
+              <w:bottom w:w="50" w:type="dxa"/>
+              <w:start w:w="90" w:type="dxa"/>
+              <w:end w:w="90" w:type="dxa"/>
+            </w:tcMar>
+            <w:shd w:fill="F3F7F9"/>
+          </w:tcPr>
+          <w:p>
+            <w:pPr>
+              <w:spacing w:after="0" w:line="240" w:lineRule="auto"/>
+              <w:jc w:val="left"/>
+            </w:pPr>
+            <w:r/>
+            <w:r>
+              <w:rPr>
+                <w:rFonts w:ascii="Microsoft YaHei" w:hAnsi="Microsoft YaHei" w:eastAsia="Microsoft YaHei"/>
+                <w:b w:val="0"/>
+                <w:color w:val="000000"/>
+                <w:sz w:val="17"/>
+              </w:rPr>
+              <w:t>马</w:t>
+            </w:r>
+          </w:p>
+        </w:tc>
+        <w:tc>
+          <w:tcPr>
+            <w:tcW w:type="dxa" w:w="2438"/>
+            <w:vAlign w:val="center"/>
+            <w:tcMar>
+              <w:top w:w="50" w:type="dxa"/>
+              <w:bottom w:w="50" w:type="dxa"/>
+              <w:start w:w="90" w:type="dxa"/>
+              <w:end w:w="90" w:type="dxa"/>
+            </w:tcMar>
+            <w:shd w:fill="F3F7F9"/>
+          </w:tcPr>
+          <w:p>
+            <w:pPr>
+              <w:spacing w:after="0" w:line="240" w:lineRule="auto"/>
+              <w:jc w:val="left"/>
+            </w:pPr>
+            <w:r/>
+            <w:r>
+              <w:rPr>
+                <w:rFonts w:ascii="Microsoft YaHei" w:hAnsi="Microsoft YaHei" w:eastAsia="Microsoft YaHei"/>
+                <w:b w:val="0"/>
+                <w:color w:val="000000"/>
+                <w:sz w:val="17"/>
+              </w:rPr>
+              <w:t>僵尸马</w:t>
+            </w:r>
+          </w:p>
+        </w:tc>
+        <w:tc>
+          <w:tcPr>
+            <w:tcW w:type="dxa" w:w="1361"/>
+            <w:vAlign w:val="center"/>
+            <w:tcMar>
+              <w:top w:w="50" w:type="dxa"/>
+              <w:bottom w:w="50" w:type="dxa"/>
+              <w:start w:w="90" w:type="dxa"/>
+              <w:end w:w="90" w:type="dxa"/>
+            </w:tcMar>
+            <w:shd w:fill="F3F7F9"/>
+          </w:tcPr>
+          <w:p>
+            <w:pPr>
+              <w:spacing w:after="0" w:line="240" w:lineRule="auto"/>
+              <w:jc w:val="left"/>
+            </w:pPr>
+            <w:r/>
+            <w:r>
+              <w:rPr>
+                <w:rFonts w:ascii="Microsoft YaHei" w:hAnsi="Microsoft YaHei" w:eastAsia="Microsoft YaHei"/>
+                <w:b w:val="0"/>
+                <w:color w:val="000000"/>
+                <w:sz w:val="17"/>
+              </w:rPr>
+              <w:t>15</w:t>
+            </w:r>
+          </w:p>
+        </w:tc>
+        <w:tc>
+          <w:tcPr>
+            <w:tcW w:type="dxa" w:w="9184"/>
+            <w:vAlign w:val="center"/>
+            <w:tcMar>
+              <w:top w:w="50" w:type="dxa"/>
+              <w:bottom w:w="50" w:type="dxa"/>
+              <w:start w:w="90" w:type="dxa"/>
+              <w:end w:w="90" w:type="dxa"/>
+            </w:tcMar>
+            <w:shd w:fill="F3F7F9"/>
+          </w:tcPr>
+          <w:p>
+            <w:pPr>
+              <w:spacing w:after="0" w:line="240" w:lineRule="auto"/>
+              <w:jc w:val="left"/>
+            </w:pPr>
+            <w:r/>
+            <w:r>
+              <w:rPr>
+                <w:rFonts w:ascii="Microsoft YaHei" w:hAnsi="Microsoft YaHei" w:eastAsia="Microsoft YaHei"/>
+                <w:b w:val="0"/>
+                <w:color w:val="000000"/>
+                <w:sz w:val="17"/>
+              </w:rPr>
+              <w:t>在我的世界 1.21.1 中没有自然生存生成入口</w:t>
+            </w:r>
+          </w:p>
+        </w:tc>
+      </w:tr>
+      <w:tr>
+        <w:trPr>
+          <w:cantSplit/>
+        </w:trPr>
+        <w:tc>
+          <w:tcPr>
+            <w:tcW w:type="dxa" w:w="2438"/>
+            <w:vAlign w:val="center"/>
+            <w:tcMar>
+              <w:top w:w="50" w:type="dxa"/>
+              <w:bottom w:w="50" w:type="dxa"/>
+              <w:start w:w="90" w:type="dxa"/>
+              <w:end w:w="90" w:type="dxa"/>
+            </w:tcMar>
+          </w:tcPr>
+          <w:p>
+            <w:pPr>
+              <w:spacing w:after="0" w:line="240" w:lineRule="auto"/>
+              <w:jc w:val="left"/>
+            </w:pPr>
+            <w:r/>
+            <w:r>
+              <w:rPr>
+                <w:rFonts w:ascii="Microsoft YaHei" w:hAnsi="Microsoft YaHei" w:eastAsia="Microsoft YaHei"/>
+                <w:b w:val="0"/>
+                <w:color w:val="000000"/>
+                <w:sz w:val="17"/>
+              </w:rPr>
+              <w:t>守卫者</w:t>
+            </w:r>
+          </w:p>
+        </w:tc>
+        <w:tc>
+          <w:tcPr>
+            <w:tcW w:type="dxa" w:w="2438"/>
+            <w:vAlign w:val="center"/>
+            <w:tcMar>
+              <w:top w:w="50" w:type="dxa"/>
+              <w:bottom w:w="50" w:type="dxa"/>
+              <w:start w:w="90" w:type="dxa"/>
+              <w:end w:w="90" w:type="dxa"/>
+            </w:tcMar>
+          </w:tcPr>
+          <w:p>
+            <w:pPr>
+              <w:spacing w:after="0" w:line="240" w:lineRule="auto"/>
+              <w:jc w:val="left"/>
+            </w:pPr>
+            <w:r/>
+            <w:r>
+              <w:rPr>
+                <w:rFonts w:ascii="Microsoft YaHei" w:hAnsi="Microsoft YaHei" w:eastAsia="Microsoft YaHei"/>
+                <w:b w:val="0"/>
+                <w:color w:val="000000"/>
+                <w:sz w:val="17"/>
+              </w:rPr>
+              <w:t>远古守卫者</w:t>
+            </w:r>
+          </w:p>
+        </w:tc>
+        <w:tc>
+          <w:tcPr>
+            <w:tcW w:type="dxa" w:w="1361"/>
+            <w:vAlign w:val="center"/>
+            <w:tcMar>
+              <w:top w:w="50" w:type="dxa"/>
+              <w:bottom w:w="50" w:type="dxa"/>
+              <w:start w:w="90" w:type="dxa"/>
+              <w:end w:w="90" w:type="dxa"/>
+            </w:tcMar>
+          </w:tcPr>
+          <w:p>
+            <w:pPr>
+              <w:spacing w:after="0" w:line="240" w:lineRule="auto"/>
+              <w:jc w:val="left"/>
+            </w:pPr>
+            <w:r/>
+            <w:r>
+              <w:rPr>
+                <w:rFonts w:ascii="Microsoft YaHei" w:hAnsi="Microsoft YaHei" w:eastAsia="Microsoft YaHei"/>
+                <w:b w:val="0"/>
+                <w:color w:val="000000"/>
+                <w:sz w:val="17"/>
+              </w:rPr>
+              <w:t>55</w:t>
+            </w:r>
+          </w:p>
+        </w:tc>
+        <w:tc>
+          <w:tcPr>
+            <w:tcW w:type="dxa" w:w="9184"/>
+            <w:vAlign w:val="center"/>
+            <w:tcMar>
+              <w:top w:w="50" w:type="dxa"/>
+              <w:bottom w:w="50" w:type="dxa"/>
+              <w:start w:w="90" w:type="dxa"/>
+              <w:end w:w="90" w:type="dxa"/>
+            </w:tcMar>
+          </w:tcPr>
+          <w:p>
+            <w:pPr>
+              <w:spacing w:after="0" w:line="240" w:lineRule="auto"/>
+              <w:jc w:val="left"/>
+            </w:pPr>
+            <w:r/>
+            <w:r>
+              <w:rPr>
+                <w:rFonts w:ascii="Microsoft YaHei" w:hAnsi="Microsoft YaHei" w:eastAsia="Microsoft YaHei"/>
+                <w:b w:val="0"/>
+                <w:color w:val="000000"/>
+                <w:sz w:val="17"/>
+              </w:rPr>
+              <w:t>原生可生成，但当前普通生物配置禁止直接捕捉</w:t>
+            </w:r>
+          </w:p>
+        </w:tc>
+      </w:tr>
+      <w:tr>
+        <w:trPr>
+          <w:cantSplit/>
+        </w:trPr>
+        <w:tc>
+          <w:tcPr>
+            <w:tcW w:type="dxa" w:w="2438"/>
+            <w:vAlign w:val="center"/>
+            <w:tcMar>
+              <w:top w:w="50" w:type="dxa"/>
+              <w:bottom w:w="50" w:type="dxa"/>
+              <w:start w:w="90" w:type="dxa"/>
+              <w:end w:w="90" w:type="dxa"/>
+            </w:tcMar>
+            <w:shd w:fill="F3F7F9"/>
+          </w:tcPr>
+          <w:p>
+            <w:pPr>
+              <w:spacing w:after="0" w:line="240" w:lineRule="auto"/>
+              <w:jc w:val="left"/>
+            </w:pPr>
+            <w:r/>
+            <w:r>
+              <w:rPr>
+                <w:rFonts w:ascii="Microsoft YaHei" w:hAnsi="Microsoft YaHei" w:eastAsia="Microsoft YaHei"/>
+                <w:b w:val="0"/>
+                <w:color w:val="000000"/>
+                <w:sz w:val="17"/>
+              </w:rPr>
+              <w:t>雪傀儡</w:t>
+            </w:r>
+          </w:p>
+        </w:tc>
+        <w:tc>
+          <w:tcPr>
+            <w:tcW w:type="dxa" w:w="2438"/>
+            <w:vAlign w:val="center"/>
+            <w:tcMar>
+              <w:top w:w="50" w:type="dxa"/>
+              <w:bottom w:w="50" w:type="dxa"/>
+              <w:start w:w="90" w:type="dxa"/>
+              <w:end w:w="90" w:type="dxa"/>
+            </w:tcMar>
+            <w:shd w:fill="F3F7F9"/>
+          </w:tcPr>
+          <w:p>
+            <w:pPr>
+              <w:spacing w:after="0" w:line="240" w:lineRule="auto"/>
+              <w:jc w:val="left"/>
+            </w:pPr>
+            <w:r/>
+            <w:r>
+              <w:rPr>
+                <w:rFonts w:ascii="Microsoft YaHei" w:hAnsi="Microsoft YaHei" w:eastAsia="Microsoft YaHei"/>
+                <w:b w:val="0"/>
+                <w:color w:val="000000"/>
+                <w:sz w:val="17"/>
+              </w:rPr>
+              <w:t>铁傀儡</w:t>
+            </w:r>
+          </w:p>
+        </w:tc>
+        <w:tc>
+          <w:tcPr>
+            <w:tcW w:type="dxa" w:w="1361"/>
+            <w:vAlign w:val="center"/>
+            <w:tcMar>
+              <w:top w:w="50" w:type="dxa"/>
+              <w:bottom w:w="50" w:type="dxa"/>
+              <w:start w:w="90" w:type="dxa"/>
+              <w:end w:w="90" w:type="dxa"/>
+            </w:tcMar>
+            <w:shd w:fill="F3F7F9"/>
+          </w:tcPr>
+          <w:p>
+            <w:pPr>
+              <w:spacing w:after="0" w:line="240" w:lineRule="auto"/>
+              <w:jc w:val="left"/>
+            </w:pPr>
+            <w:r/>
+            <w:r>
+              <w:rPr>
+                <w:rFonts w:ascii="Microsoft YaHei" w:hAnsi="Microsoft YaHei" w:eastAsia="Microsoft YaHei"/>
+                <w:b w:val="0"/>
+                <w:color w:val="000000"/>
+                <w:sz w:val="17"/>
+              </w:rPr>
+              <w:t>35</w:t>
+            </w:r>
+          </w:p>
+        </w:tc>
+        <w:tc>
+          <w:tcPr>
+            <w:tcW w:type="dxa" w:w="9184"/>
+            <w:vAlign w:val="center"/>
+            <w:tcMar>
+              <w:top w:w="50" w:type="dxa"/>
+              <w:bottom w:w="50" w:type="dxa"/>
+              <w:start w:w="90" w:type="dxa"/>
+              <w:end w:w="90" w:type="dxa"/>
+            </w:tcMar>
+            <w:shd w:fill="F3F7F9"/>
+          </w:tcPr>
+          <w:p>
+            <w:pPr>
+              <w:spacing w:after="0" w:line="240" w:lineRule="auto"/>
+              <w:jc w:val="left"/>
+            </w:pPr>
+            <w:r/>
+            <w:r>
+              <w:rPr>
+                <w:rFonts w:ascii="Microsoft YaHei" w:hAnsi="Microsoft YaHei" w:eastAsia="Microsoft YaHei"/>
+                <w:b w:val="0"/>
+                <w:color w:val="000000"/>
+                <w:sz w:val="17"/>
+              </w:rPr>
+              <w:t>原生可制造或生成，但当前普通生物配置禁止直接捕捉</w:t>
+            </w:r>
+          </w:p>
+        </w:tc>
+      </w:tr>
+      <w:tr>
+        <w:trPr>
+          <w:cantSplit/>
+        </w:trPr>
+        <w:tc>
+          <w:tcPr>
+            <w:tcW w:type="dxa" w:w="2438"/>
+            <w:vAlign w:val="center"/>
+            <w:tcMar>
+              <w:top w:w="50" w:type="dxa"/>
+              <w:bottom w:w="50" w:type="dxa"/>
+              <w:start w:w="90" w:type="dxa"/>
+              <w:end w:w="90" w:type="dxa"/>
+            </w:tcMar>
+          </w:tcPr>
+          <w:p>
+            <w:pPr>
+              <w:spacing w:after="0" w:line="240" w:lineRule="auto"/>
+              <w:jc w:val="left"/>
+            </w:pPr>
+            <w:r/>
+            <w:r>
+              <w:rPr>
+                <w:rFonts w:ascii="Microsoft YaHei" w:hAnsi="Microsoft YaHei" w:eastAsia="Microsoft YaHei"/>
+                <w:b w:val="0"/>
+                <w:color w:val="000000"/>
+                <w:sz w:val="17"/>
+              </w:rPr>
+              <w:t>掠夺者</w:t>
+            </w:r>
+          </w:p>
+        </w:tc>
+        <w:tc>
+          <w:tcPr>
+            <w:tcW w:type="dxa" w:w="2438"/>
+            <w:vAlign w:val="center"/>
+            <w:tcMar>
+              <w:top w:w="50" w:type="dxa"/>
+              <w:bottom w:w="50" w:type="dxa"/>
+              <w:start w:w="90" w:type="dxa"/>
+              <w:end w:w="90" w:type="dxa"/>
+            </w:tcMar>
+          </w:tcPr>
+          <w:p>
+            <w:pPr>
+              <w:spacing w:after="0" w:line="240" w:lineRule="auto"/>
+              <w:jc w:val="left"/>
+            </w:pPr>
+            <w:r/>
+            <w:r>
+              <w:rPr>
+                <w:rFonts w:ascii="Microsoft YaHei" w:hAnsi="Microsoft YaHei" w:eastAsia="Microsoft YaHei"/>
+                <w:b w:val="0"/>
+                <w:color w:val="000000"/>
+                <w:sz w:val="17"/>
+              </w:rPr>
+              <w:t>劫掠兽</w:t>
+            </w:r>
+          </w:p>
+        </w:tc>
+        <w:tc>
+          <w:tcPr>
+            <w:tcW w:type="dxa" w:w="1361"/>
+            <w:vAlign w:val="center"/>
+            <w:tcMar>
+              <w:top w:w="50" w:type="dxa"/>
+              <w:bottom w:w="50" w:type="dxa"/>
+              <w:start w:w="90" w:type="dxa"/>
+              <w:end w:w="90" w:type="dxa"/>
+            </w:tcMar>
+          </w:tcPr>
+          <w:p>
+            <w:pPr>
+              <w:spacing w:after="0" w:line="240" w:lineRule="auto"/>
+              <w:jc w:val="left"/>
+            </w:pPr>
+            <w:r/>
+            <w:r>
+              <w:rPr>
+                <w:rFonts w:ascii="Microsoft YaHei" w:hAnsi="Microsoft YaHei" w:eastAsia="Microsoft YaHei"/>
+                <w:b w:val="0"/>
+                <w:color w:val="000000"/>
+                <w:sz w:val="17"/>
+              </w:rPr>
+              <w:t>50</w:t>
+            </w:r>
+          </w:p>
+        </w:tc>
+        <w:tc>
+          <w:tcPr>
+            <w:tcW w:type="dxa" w:w="9184"/>
+            <w:vAlign w:val="center"/>
+            <w:tcMar>
+              <w:top w:w="50" w:type="dxa"/>
+              <w:bottom w:w="50" w:type="dxa"/>
+              <w:start w:w="90" w:type="dxa"/>
+              <w:end w:w="90" w:type="dxa"/>
+            </w:tcMar>
+          </w:tcPr>
+          <w:p>
+            <w:pPr>
+              <w:spacing w:after="0" w:line="240" w:lineRule="auto"/>
+              <w:jc w:val="left"/>
+            </w:pPr>
+            <w:r/>
+            <w:r>
+              <w:rPr>
+                <w:rFonts w:ascii="Microsoft YaHei" w:hAnsi="Microsoft YaHei" w:eastAsia="Microsoft YaHei"/>
+                <w:b w:val="0"/>
+                <w:color w:val="000000"/>
+                <w:sz w:val="17"/>
+              </w:rPr>
+              <w:t>原生可在袭击生成，但当前普通生物配置禁止直接捕捉</w:t>
+            </w:r>
+          </w:p>
+        </w:tc>
+      </w:tr>
+      <w:tr>
+        <w:trPr>
+          <w:cantSplit/>
+        </w:trPr>
+        <w:tc>
+          <w:tcPr>
+            <w:tcW w:type="dxa" w:w="2438"/>
+            <w:vAlign w:val="center"/>
+            <w:tcMar>
+              <w:top w:w="50" w:type="dxa"/>
+              <w:bottom w:w="50" w:type="dxa"/>
+              <w:start w:w="90" w:type="dxa"/>
+              <w:end w:w="90" w:type="dxa"/>
+            </w:tcMar>
+            <w:shd w:fill="F3F7F9"/>
+          </w:tcPr>
+          <w:p>
+            <w:pPr>
+              <w:spacing w:after="0" w:line="240" w:lineRule="auto"/>
+              <w:jc w:val="left"/>
+            </w:pPr>
+            <w:r/>
+            <w:r>
+              <w:rPr>
+                <w:rFonts w:ascii="Microsoft YaHei" w:hAnsi="Microsoft YaHei" w:eastAsia="Microsoft YaHei"/>
+                <w:b w:val="0"/>
+                <w:color w:val="000000"/>
+                <w:sz w:val="17"/>
+              </w:rPr>
+              <w:t>僵尸村民</w:t>
+            </w:r>
+          </w:p>
+        </w:tc>
+        <w:tc>
+          <w:tcPr>
+            <w:tcW w:type="dxa" w:w="2438"/>
+            <w:vAlign w:val="center"/>
+            <w:tcMar>
+              <w:top w:w="50" w:type="dxa"/>
+              <w:bottom w:w="50" w:type="dxa"/>
+              <w:start w:w="90" w:type="dxa"/>
+              <w:end w:w="90" w:type="dxa"/>
+            </w:tcMar>
+            <w:shd w:fill="F3F7F9"/>
+          </w:tcPr>
+          <w:p>
+            <w:pPr>
+              <w:spacing w:after="0" w:line="240" w:lineRule="auto"/>
+              <w:jc w:val="left"/>
+            </w:pPr>
+            <w:r/>
+            <w:r>
+              <w:rPr>
+                <w:rFonts w:ascii="Microsoft YaHei" w:hAnsi="Microsoft YaHei" w:eastAsia="Microsoft YaHei"/>
+                <w:b w:val="0"/>
+                <w:color w:val="000000"/>
+                <w:sz w:val="17"/>
+              </w:rPr>
+              <w:t>村民</w:t>
+            </w:r>
+          </w:p>
+        </w:tc>
+        <w:tc>
+          <w:tcPr>
+            <w:tcW w:type="dxa" w:w="1361"/>
+            <w:vAlign w:val="center"/>
+            <w:tcMar>
+              <w:top w:w="50" w:type="dxa"/>
+              <w:bottom w:w="50" w:type="dxa"/>
+              <w:start w:w="90" w:type="dxa"/>
+              <w:end w:w="90" w:type="dxa"/>
+            </w:tcMar>
+            <w:shd w:fill="F3F7F9"/>
+          </w:tcPr>
+          <w:p>
+            <w:pPr>
+              <w:spacing w:after="0" w:line="240" w:lineRule="auto"/>
+              <w:jc w:val="left"/>
+            </w:pPr>
+            <w:r/>
+            <w:r>
+              <w:rPr>
+                <w:rFonts w:ascii="Microsoft YaHei" w:hAnsi="Microsoft YaHei" w:eastAsia="Microsoft YaHei"/>
+                <w:b w:val="0"/>
+                <w:color w:val="000000"/>
+                <w:sz w:val="17"/>
+              </w:rPr>
+              <w:t>20</w:t>
+            </w:r>
+          </w:p>
+        </w:tc>
+        <w:tc>
+          <w:tcPr>
+            <w:tcW w:type="dxa" w:w="9184"/>
+            <w:vAlign w:val="center"/>
+            <w:tcMar>
+              <w:top w:w="50" w:type="dxa"/>
+              <w:bottom w:w="50" w:type="dxa"/>
+              <w:start w:w="90" w:type="dxa"/>
+              <w:end w:w="90" w:type="dxa"/>
+            </w:tcMar>
+            <w:shd w:fill="F3F7F9"/>
+          </w:tcPr>
+          <w:p>
+            <w:pPr>
+              <w:spacing w:after="0" w:line="240" w:lineRule="auto"/>
+              <w:jc w:val="left"/>
+            </w:pPr>
+            <w:r/>
+            <w:r>
+              <w:rPr>
+                <w:rFonts w:ascii="Microsoft YaHei" w:hAnsi="Microsoft YaHei" w:eastAsia="Microsoft YaHei"/>
+                <w:b w:val="0"/>
+                <w:color w:val="000000"/>
+                <w:sz w:val="17"/>
+              </w:rPr>
+              <w:t>原生可生成或治疗，但当前普通生物配置禁止直接捕捉</w:t>
+            </w:r>
+          </w:p>
+        </w:tc>
+      </w:tr>
+      <w:tr>
+        <w:trPr>
+          <w:cantSplit/>
+        </w:trPr>
+        <w:tc>
+          <w:tcPr>
+            <w:tcW w:type="dxa" w:w="2438"/>
+            <w:vAlign w:val="center"/>
+            <w:tcMar>
+              <w:top w:w="50" w:type="dxa"/>
+              <w:bottom w:w="50" w:type="dxa"/>
+              <w:start w:w="90" w:type="dxa"/>
+              <w:end w:w="90" w:type="dxa"/>
+            </w:tcMar>
+          </w:tcPr>
+          <w:p>
+            <w:pPr>
+              <w:spacing w:after="0" w:line="240" w:lineRule="auto"/>
+              <w:jc w:val="left"/>
+            </w:pPr>
+            <w:r/>
+            <w:r>
+              <w:rPr>
+                <w:rFonts w:ascii="Microsoft YaHei" w:hAnsi="Microsoft YaHei" w:eastAsia="Microsoft YaHei"/>
+                <w:b w:val="0"/>
+                <w:color w:val="000000"/>
+                <w:sz w:val="17"/>
+              </w:rPr>
+              <w:t>村民</w:t>
+            </w:r>
+          </w:p>
+        </w:tc>
+        <w:tc>
+          <w:tcPr>
+            <w:tcW w:type="dxa" w:w="2438"/>
+            <w:vAlign w:val="center"/>
+            <w:tcMar>
+              <w:top w:w="50" w:type="dxa"/>
+              <w:bottom w:w="50" w:type="dxa"/>
+              <w:start w:w="90" w:type="dxa"/>
+              <w:end w:w="90" w:type="dxa"/>
+            </w:tcMar>
+          </w:tcPr>
+          <w:p>
+            <w:pPr>
+              <w:spacing w:after="0" w:line="240" w:lineRule="auto"/>
+              <w:jc w:val="left"/>
+            </w:pPr>
+            <w:r/>
+            <w:r>
+              <w:rPr>
+                <w:rFonts w:ascii="Microsoft YaHei" w:hAnsi="Microsoft YaHei" w:eastAsia="Microsoft YaHei"/>
+                <w:b w:val="0"/>
+                <w:color w:val="000000"/>
+                <w:sz w:val="17"/>
+              </w:rPr>
+              <w:t>流浪商人</w:t>
+            </w:r>
+          </w:p>
+        </w:tc>
+        <w:tc>
+          <w:tcPr>
+            <w:tcW w:type="dxa" w:w="1361"/>
+            <w:vAlign w:val="center"/>
+            <w:tcMar>
+              <w:top w:w="50" w:type="dxa"/>
+              <w:bottom w:w="50" w:type="dxa"/>
+              <w:start w:w="90" w:type="dxa"/>
+              <w:end w:w="90" w:type="dxa"/>
+            </w:tcMar>
+          </w:tcPr>
+          <w:p>
+            <w:pPr>
+              <w:spacing w:after="0" w:line="240" w:lineRule="auto"/>
+              <w:jc w:val="left"/>
+            </w:pPr>
+            <w:r/>
+            <w:r>
+              <w:rPr>
+                <w:rFonts w:ascii="Microsoft YaHei" w:hAnsi="Microsoft YaHei" w:eastAsia="Microsoft YaHei"/>
+                <w:b w:val="0"/>
+                <w:color w:val="000000"/>
+                <w:sz w:val="17"/>
+              </w:rPr>
+              <w:t>25</w:t>
+            </w:r>
+          </w:p>
+        </w:tc>
+        <w:tc>
+          <w:tcPr>
+            <w:tcW w:type="dxa" w:w="9184"/>
+            <w:vAlign w:val="center"/>
+            <w:tcMar>
+              <w:top w:w="50" w:type="dxa"/>
+              <w:bottom w:w="50" w:type="dxa"/>
+              <w:start w:w="90" w:type="dxa"/>
+              <w:end w:w="90" w:type="dxa"/>
+            </w:tcMar>
+          </w:tcPr>
+          <w:p>
+            <w:pPr>
+              <w:spacing w:after="0" w:line="240" w:lineRule="auto"/>
+              <w:jc w:val="left"/>
+            </w:pPr>
+            <w:r/>
+            <w:r>
+              <w:rPr>
+                <w:rFonts w:ascii="Microsoft YaHei" w:hAnsi="Microsoft YaHei" w:eastAsia="Microsoft YaHei"/>
+                <w:b w:val="0"/>
+                <w:color w:val="000000"/>
+                <w:sz w:val="17"/>
+              </w:rPr>
+              <w:t>原生可生成，但当前普通生物配置禁止直接捕捉</w:t>
+            </w:r>
+          </w:p>
+        </w:tc>
+      </w:tr>
+      <w:tr>
+        <w:trPr>
+          <w:cantSplit/>
+        </w:trPr>
+        <w:tc>
+          <w:tcPr>
+            <w:tcW w:type="dxa" w:w="2438"/>
+            <w:vAlign w:val="center"/>
+            <w:tcMar>
+              <w:top w:w="50" w:type="dxa"/>
+              <w:bottom w:w="50" w:type="dxa"/>
+              <w:start w:w="90" w:type="dxa"/>
+              <w:end w:w="90" w:type="dxa"/>
+            </w:tcMar>
+            <w:shd w:fill="F3F7F9"/>
+          </w:tcPr>
+          <w:p>
+            <w:pPr>
+              <w:spacing w:after="0" w:line="240" w:lineRule="auto"/>
+              <w:jc w:val="left"/>
+            </w:pPr>
+            <w:r/>
+            <w:r>
+              <w:rPr>
+                <w:rFonts w:ascii="Microsoft YaHei" w:hAnsi="Microsoft YaHei" w:eastAsia="Microsoft YaHei"/>
+                <w:b w:val="0"/>
+                <w:color w:val="000000"/>
+                <w:sz w:val="17"/>
+              </w:rPr>
+              <w:t>巨人矿工</w:t>
+            </w:r>
+          </w:p>
+        </w:tc>
+        <w:tc>
+          <w:tcPr>
+            <w:tcW w:type="dxa" w:w="2438"/>
+            <w:vAlign w:val="center"/>
+            <w:tcMar>
+              <w:top w:w="50" w:type="dxa"/>
+              <w:bottom w:w="50" w:type="dxa"/>
+              <w:start w:w="90" w:type="dxa"/>
+              <w:end w:w="90" w:type="dxa"/>
+            </w:tcMar>
+            <w:shd w:fill="F3F7F9"/>
+          </w:tcPr>
+          <w:p>
+            <w:pPr>
+              <w:spacing w:after="0" w:line="240" w:lineRule="auto"/>
+              <w:jc w:val="left"/>
+            </w:pPr>
+            <w:r/>
+            <w:r>
+              <w:rPr>
+                <w:rFonts w:ascii="Microsoft YaHei" w:hAnsi="Microsoft YaHei" w:eastAsia="Microsoft YaHei"/>
+                <w:b w:val="0"/>
+                <w:color w:val="000000"/>
+                <w:sz w:val="17"/>
+              </w:rPr>
+              <w:t>武装巨人</w:t>
+            </w:r>
+          </w:p>
+        </w:tc>
+        <w:tc>
+          <w:tcPr>
+            <w:tcW w:type="dxa" w:w="1361"/>
+            <w:vAlign w:val="center"/>
+            <w:tcMar>
+              <w:top w:w="50" w:type="dxa"/>
+              <w:bottom w:w="50" w:type="dxa"/>
+              <w:start w:w="90" w:type="dxa"/>
+              <w:end w:w="90" w:type="dxa"/>
+            </w:tcMar>
+            <w:shd w:fill="F3F7F9"/>
+          </w:tcPr>
+          <w:p>
+            <w:pPr>
+              <w:spacing w:after="0" w:line="240" w:lineRule="auto"/>
+              <w:jc w:val="left"/>
+            </w:pPr>
+            <w:r/>
+            <w:r>
+              <w:rPr>
+                <w:rFonts w:ascii="Microsoft YaHei" w:hAnsi="Microsoft YaHei" w:eastAsia="Microsoft YaHei"/>
+                <w:b w:val="0"/>
+                <w:color w:val="000000"/>
+                <w:sz w:val="17"/>
+              </w:rPr>
+              <w:t>55</w:t>
+            </w:r>
+          </w:p>
+        </w:tc>
+        <w:tc>
+          <w:tcPr>
+            <w:tcW w:type="dxa" w:w="9184"/>
+            <w:vAlign w:val="center"/>
+            <w:tcMar>
+              <w:top w:w="50" w:type="dxa"/>
+              <w:bottom w:w="50" w:type="dxa"/>
+              <w:start w:w="90" w:type="dxa"/>
+              <w:end w:w="90" w:type="dxa"/>
+            </w:tcMar>
+            <w:shd w:fill="F3F7F9"/>
+          </w:tcPr>
+          <w:p>
+            <w:pPr>
+              <w:spacing w:after="0" w:line="240" w:lineRule="auto"/>
+              <w:jc w:val="left"/>
+            </w:pPr>
+            <w:r/>
+            <w:r>
+              <w:rPr>
+                <w:rFonts w:ascii="Microsoft YaHei" w:hAnsi="Microsoft YaHei" w:eastAsia="Microsoft YaHei"/>
+                <w:b w:val="0"/>
+                <w:color w:val="000000"/>
+                <w:sz w:val="17"/>
+              </w:rPr>
+              <w:t>原生可生成，但当前普通生物配置禁止直接捕捉</w:t>
+            </w:r>
+          </w:p>
+        </w:tc>
+      </w:tr>
+      <w:tr>
+        <w:trPr>
+          <w:cantSplit/>
+        </w:trPr>
+        <w:tc>
+          <w:tcPr>
+            <w:tcW w:type="dxa" w:w="2438"/>
+            <w:vAlign w:val="center"/>
+            <w:tcMar>
+              <w:top w:w="50" w:type="dxa"/>
+              <w:bottom w:w="50" w:type="dxa"/>
+              <w:start w:w="90" w:type="dxa"/>
+              <w:end w:w="90" w:type="dxa"/>
+            </w:tcMar>
+          </w:tcPr>
+          <w:p>
+            <w:pPr>
+              <w:spacing w:after="0" w:line="240" w:lineRule="auto"/>
+              <w:jc w:val="left"/>
+            </w:pPr>
+            <w:r/>
+            <w:r>
+              <w:rPr>
+                <w:rFonts w:ascii="Microsoft YaHei" w:hAnsi="Microsoft YaHei" w:eastAsia="Microsoft YaHei"/>
+                <w:b w:val="0"/>
+                <w:color w:val="000000"/>
+                <w:sz w:val="17"/>
+              </w:rPr>
+              <w:t>骷髅德鲁伊</w:t>
+            </w:r>
+          </w:p>
+        </w:tc>
+        <w:tc>
+          <w:tcPr>
+            <w:tcW w:type="dxa" w:w="2438"/>
+            <w:vAlign w:val="center"/>
+            <w:tcMar>
+              <w:top w:w="50" w:type="dxa"/>
+              <w:bottom w:w="50" w:type="dxa"/>
+              <w:start w:w="90" w:type="dxa"/>
+              <w:end w:w="90" w:type="dxa"/>
+            </w:tcMar>
+          </w:tcPr>
+          <w:p>
+            <w:pPr>
+              <w:spacing w:after="0" w:line="240" w:lineRule="auto"/>
+              <w:jc w:val="left"/>
+            </w:pPr>
+            <w:r/>
+            <w:r>
+              <w:rPr>
+                <w:rFonts w:ascii="Microsoft YaHei" w:hAnsi="Microsoft YaHei" w:eastAsia="Microsoft YaHei"/>
+                <w:b w:val="0"/>
+                <w:color w:val="000000"/>
+                <w:sz w:val="17"/>
+              </w:rPr>
+              <w:t>信徒</w:t>
+            </w:r>
+          </w:p>
+        </w:tc>
+        <w:tc>
+          <w:tcPr>
+            <w:tcW w:type="dxa" w:w="1361"/>
+            <w:vAlign w:val="center"/>
+            <w:tcMar>
+              <w:top w:w="50" w:type="dxa"/>
+              <w:bottom w:w="50" w:type="dxa"/>
+              <w:start w:w="90" w:type="dxa"/>
+              <w:end w:w="90" w:type="dxa"/>
+            </w:tcMar>
+          </w:tcPr>
+          <w:p>
+            <w:pPr>
+              <w:spacing w:after="0" w:line="240" w:lineRule="auto"/>
+              <w:jc w:val="left"/>
+            </w:pPr>
+            <w:r/>
+            <w:r>
+              <w:rPr>
+                <w:rFonts w:ascii="Microsoft YaHei" w:hAnsi="Microsoft YaHei" w:eastAsia="Microsoft YaHei"/>
+                <w:b w:val="0"/>
+                <w:color w:val="000000"/>
+                <w:sz w:val="17"/>
+              </w:rPr>
+              <w:t>35</w:t>
+            </w:r>
+          </w:p>
+        </w:tc>
+        <w:tc>
+          <w:tcPr>
+            <w:tcW w:type="dxa" w:w="9184"/>
+            <w:vAlign w:val="center"/>
+            <w:tcMar>
+              <w:top w:w="50" w:type="dxa"/>
+              <w:bottom w:w="50" w:type="dxa"/>
+              <w:start w:w="90" w:type="dxa"/>
+              <w:end w:w="90" w:type="dxa"/>
+            </w:tcMar>
+          </w:tcPr>
+          <w:p>
+            <w:pPr>
+              <w:spacing w:after="0" w:line="240" w:lineRule="auto"/>
+              <w:jc w:val="left"/>
+            </w:pPr>
+            <w:r/>
+            <w:r>
+              <w:rPr>
+                <w:rFonts w:ascii="Microsoft YaHei" w:hAnsi="Microsoft YaHei" w:eastAsia="Microsoft YaHei"/>
+                <w:b w:val="0"/>
+                <w:color w:val="000000"/>
+                <w:sz w:val="17"/>
+              </w:rPr>
+              <w:t>当前来源版本未发现生存生成入口</w:t>
+            </w:r>
+          </w:p>
+        </w:tc>
+      </w:tr>
+      <w:tr>
+        <w:trPr>
+          <w:cantSplit/>
+        </w:trPr>
+        <w:tc>
+          <w:tcPr>
+            <w:tcW w:type="dxa" w:w="2438"/>
+            <w:vAlign w:val="center"/>
+            <w:tcMar>
+              <w:top w:w="50" w:type="dxa"/>
+              <w:bottom w:w="50" w:type="dxa"/>
+              <w:start w:w="90" w:type="dxa"/>
+              <w:end w:w="90" w:type="dxa"/>
+            </w:tcMar>
+            <w:shd w:fill="F3F7F9"/>
+          </w:tcPr>
+          <w:p>
+            <w:pPr>
+              <w:spacing w:after="0" w:line="240" w:lineRule="auto"/>
+              <w:jc w:val="left"/>
+            </w:pPr>
+            <w:r/>
+            <w:r>
+              <w:rPr>
+                <w:rFonts w:ascii="Microsoft YaHei" w:hAnsi="Microsoft YaHei" w:eastAsia="Microsoft YaHei"/>
+                <w:b w:val="0"/>
+                <w:color w:val="000000"/>
+                <w:sz w:val="17"/>
+              </w:rPr>
+              <w:t>岩浆怪</w:t>
+            </w:r>
+          </w:p>
+        </w:tc>
+        <w:tc>
+          <w:tcPr>
+            <w:tcW w:type="dxa" w:w="2438"/>
+            <w:vAlign w:val="center"/>
+            <w:tcMar>
+              <w:top w:w="50" w:type="dxa"/>
+              <w:bottom w:w="50" w:type="dxa"/>
+              <w:start w:w="90" w:type="dxa"/>
+              <w:end w:w="90" w:type="dxa"/>
+            </w:tcMar>
+            <w:shd w:fill="F3F7F9"/>
+          </w:tcPr>
+          <w:p>
+            <w:pPr>
+              <w:spacing w:after="0" w:line="240" w:lineRule="auto"/>
+              <w:jc w:val="left"/>
+            </w:pPr>
+            <w:r/>
+            <w:r>
+              <w:rPr>
+                <w:rFonts w:ascii="Microsoft YaHei" w:hAnsi="Microsoft YaHei" w:eastAsia="Microsoft YaHei"/>
+                <w:b w:val="0"/>
+                <w:color w:val="000000"/>
+                <w:sz w:val="17"/>
+              </w:rPr>
+              <w:t>噩兆立方</w:t>
+            </w:r>
+          </w:p>
+        </w:tc>
+        <w:tc>
+          <w:tcPr>
+            <w:tcW w:type="dxa" w:w="1361"/>
+            <w:vAlign w:val="center"/>
+            <w:tcMar>
+              <w:top w:w="50" w:type="dxa"/>
+              <w:bottom w:w="50" w:type="dxa"/>
+              <w:start w:w="90" w:type="dxa"/>
+              <w:end w:w="90" w:type="dxa"/>
+            </w:tcMar>
+            <w:shd w:fill="F3F7F9"/>
+          </w:tcPr>
+          <w:p>
+            <w:pPr>
+              <w:spacing w:after="0" w:line="240" w:lineRule="auto"/>
+              <w:jc w:val="left"/>
+            </w:pPr>
+            <w:r/>
+            <w:r>
+              <w:rPr>
+                <w:rFonts w:ascii="Microsoft YaHei" w:hAnsi="Microsoft YaHei" w:eastAsia="Microsoft YaHei"/>
+                <w:b w:val="0"/>
+                <w:color w:val="000000"/>
+                <w:sz w:val="17"/>
+              </w:rPr>
+              <w:t>30</w:t>
+            </w:r>
+          </w:p>
+        </w:tc>
+        <w:tc>
+          <w:tcPr>
+            <w:tcW w:type="dxa" w:w="9184"/>
+            <w:vAlign w:val="center"/>
+            <w:tcMar>
+              <w:top w:w="50" w:type="dxa"/>
+              <w:bottom w:w="50" w:type="dxa"/>
+              <w:start w:w="90" w:type="dxa"/>
+              <w:end w:w="90" w:type="dxa"/>
+            </w:tcMar>
+            <w:shd w:fill="F3F7F9"/>
+          </w:tcPr>
+          <w:p>
+            <w:pPr>
+              <w:spacing w:after="0" w:line="240" w:lineRule="auto"/>
+              <w:jc w:val="left"/>
+            </w:pPr>
+            <w:r/>
+            <w:r>
+              <w:rPr>
+                <w:rFonts w:ascii="Microsoft YaHei" w:hAnsi="Microsoft YaHei" w:eastAsia="Microsoft YaHei"/>
+                <w:b w:val="0"/>
+                <w:color w:val="000000"/>
+                <w:sz w:val="17"/>
+              </w:rPr>
+              <w:t>当前来源版本未发现生存生成入口</w:t>
+            </w:r>
+          </w:p>
+        </w:tc>
+      </w:tr>
+      <w:tr>
+        <w:trPr>
+          <w:cantSplit/>
+        </w:trPr>
+        <w:tc>
+          <w:tcPr>
+            <w:tcW w:type="dxa" w:w="2438"/>
+            <w:vAlign w:val="center"/>
+            <w:tcMar>
+              <w:top w:w="50" w:type="dxa"/>
+              <w:bottom w:w="50" w:type="dxa"/>
+              <w:start w:w="90" w:type="dxa"/>
+              <w:end w:w="90" w:type="dxa"/>
+            </w:tcMar>
+          </w:tcPr>
+          <w:p>
+            <w:pPr>
+              <w:spacing w:after="0" w:line="240" w:lineRule="auto"/>
+              <w:jc w:val="left"/>
+            </w:pPr>
+            <w:r/>
+            <w:r>
+              <w:rPr>
+                <w:rFonts w:ascii="Microsoft YaHei" w:hAnsi="Microsoft YaHei" w:eastAsia="Microsoft YaHei"/>
+                <w:b w:val="0"/>
+                <w:color w:val="000000"/>
+                <w:sz w:val="17"/>
+              </w:rPr>
+              <w:t>迷宫史莱姆</w:t>
+            </w:r>
+          </w:p>
+        </w:tc>
+        <w:tc>
+          <w:tcPr>
+            <w:tcW w:type="dxa" w:w="2438"/>
+            <w:vAlign w:val="center"/>
+            <w:tcMar>
+              <w:top w:w="50" w:type="dxa"/>
+              <w:bottom w:w="50" w:type="dxa"/>
+              <w:start w:w="90" w:type="dxa"/>
+              <w:end w:w="90" w:type="dxa"/>
+            </w:tcMar>
+          </w:tcPr>
+          <w:p>
+            <w:pPr>
+              <w:spacing w:after="0" w:line="240" w:lineRule="auto"/>
+              <w:jc w:val="left"/>
+            </w:pPr>
+            <w:r/>
+            <w:r>
+              <w:rPr>
+                <w:rFonts w:ascii="Microsoft YaHei" w:hAnsi="Microsoft YaHei" w:eastAsia="Microsoft YaHei"/>
+                <w:b w:val="0"/>
+                <w:color w:val="000000"/>
+                <w:sz w:val="17"/>
+              </w:rPr>
+              <w:t>漫游立方</w:t>
+            </w:r>
+          </w:p>
+        </w:tc>
+        <w:tc>
+          <w:tcPr>
+            <w:tcW w:type="dxa" w:w="1361"/>
+            <w:vAlign w:val="center"/>
+            <w:tcMar>
+              <w:top w:w="50" w:type="dxa"/>
+              <w:bottom w:w="50" w:type="dxa"/>
+              <w:start w:w="90" w:type="dxa"/>
+              <w:end w:w="90" w:type="dxa"/>
+            </w:tcMar>
+          </w:tcPr>
+          <w:p>
+            <w:pPr>
+              <w:spacing w:after="0" w:line="240" w:lineRule="auto"/>
+              <w:jc w:val="left"/>
+            </w:pPr>
+            <w:r/>
+            <w:r>
+              <w:rPr>
+                <w:rFonts w:ascii="Microsoft YaHei" w:hAnsi="Microsoft YaHei" w:eastAsia="Microsoft YaHei"/>
+                <w:b w:val="0"/>
+                <w:color w:val="000000"/>
+                <w:sz w:val="17"/>
+              </w:rPr>
+              <w:t>35</w:t>
+            </w:r>
+          </w:p>
+        </w:tc>
+        <w:tc>
+          <w:tcPr>
+            <w:tcW w:type="dxa" w:w="9184"/>
+            <w:vAlign w:val="center"/>
+            <w:tcMar>
+              <w:top w:w="50" w:type="dxa"/>
+              <w:bottom w:w="50" w:type="dxa"/>
+              <w:start w:w="90" w:type="dxa"/>
+              <w:end w:w="90" w:type="dxa"/>
+            </w:tcMar>
+          </w:tcPr>
+          <w:p>
+            <w:pPr>
+              <w:spacing w:after="0" w:line="240" w:lineRule="auto"/>
+              <w:jc w:val="left"/>
+            </w:pPr>
+            <w:r/>
+            <w:r>
+              <w:rPr>
+                <w:rFonts w:ascii="Microsoft YaHei" w:hAnsi="Microsoft YaHei" w:eastAsia="Microsoft YaHei"/>
+                <w:b w:val="0"/>
+                <w:color w:val="000000"/>
+                <w:sz w:val="17"/>
+              </w:rPr>
+              <w:t>当前来源版本未发现生存生成入口</w:t>
+            </w:r>
+          </w:p>
+        </w:tc>
+      </w:tr>
+      <w:tr>
+        <w:trPr>
+          <w:cantSplit/>
+        </w:trPr>
+        <w:tc>
+          <w:tcPr>
+            <w:tcW w:type="dxa" w:w="2438"/>
+            <w:vAlign w:val="center"/>
+            <w:tcMar>
+              <w:top w:w="50" w:type="dxa"/>
+              <w:bottom w:w="50" w:type="dxa"/>
+              <w:start w:w="90" w:type="dxa"/>
+              <w:end w:w="90" w:type="dxa"/>
+            </w:tcMar>
+            <w:shd w:fill="F3F7F9"/>
+          </w:tcPr>
+          <w:p>
+            <w:pPr>
+              <w:spacing w:after="0" w:line="240" w:lineRule="auto"/>
+              <w:jc w:val="left"/>
+            </w:pPr>
+            <w:r/>
+            <w:r>
+              <w:rPr>
+                <w:rFonts w:ascii="Microsoft YaHei" w:hAnsi="Microsoft YaHei" w:eastAsia="Microsoft YaHei"/>
+                <w:b w:val="0"/>
+                <w:color w:val="000000"/>
+                <w:sz w:val="17"/>
+              </w:rPr>
+              <w:t>稳定冰核</w:t>
+            </w:r>
+          </w:p>
+        </w:tc>
+        <w:tc>
+          <w:tcPr>
+            <w:tcW w:type="dxa" w:w="2438"/>
+            <w:vAlign w:val="center"/>
+            <w:tcMar>
+              <w:top w:w="50" w:type="dxa"/>
+              <w:bottom w:w="50" w:type="dxa"/>
+              <w:start w:w="90" w:type="dxa"/>
+              <w:end w:w="90" w:type="dxa"/>
+            </w:tcMar>
+            <w:shd w:fill="F3F7F9"/>
+          </w:tcPr>
+          <w:p>
+            <w:pPr>
+              <w:spacing w:after="0" w:line="240" w:lineRule="auto"/>
+              <w:jc w:val="left"/>
+            </w:pPr>
+            <w:r/>
+            <w:r>
+              <w:rPr>
+                <w:rFonts w:ascii="Microsoft YaHei" w:hAnsi="Microsoft YaHei" w:eastAsia="Microsoft YaHei"/>
+                <w:b w:val="0"/>
+                <w:color w:val="000000"/>
+                <w:sz w:val="17"/>
+              </w:rPr>
+              <w:t>冰晶</w:t>
+            </w:r>
+          </w:p>
+        </w:tc>
+        <w:tc>
+          <w:tcPr>
+            <w:tcW w:type="dxa" w:w="1361"/>
+            <w:vAlign w:val="center"/>
+            <w:tcMar>
+              <w:top w:w="50" w:type="dxa"/>
+              <w:bottom w:w="50" w:type="dxa"/>
+              <w:start w:w="90" w:type="dxa"/>
+              <w:end w:w="90" w:type="dxa"/>
+            </w:tcMar>
+            <w:shd w:fill="F3F7F9"/>
+          </w:tcPr>
+          <w:p>
+            <w:pPr>
+              <w:spacing w:after="0" w:line="240" w:lineRule="auto"/>
+              <w:jc w:val="left"/>
+            </w:pPr>
+            <w:r/>
+            <w:r>
+              <w:rPr>
+                <w:rFonts w:ascii="Microsoft YaHei" w:hAnsi="Microsoft YaHei" w:eastAsia="Microsoft YaHei"/>
+                <w:b w:val="0"/>
+                <w:color w:val="000000"/>
+                <w:sz w:val="17"/>
+              </w:rPr>
+              <w:t>35</w:t>
+            </w:r>
+          </w:p>
+        </w:tc>
+        <w:tc>
+          <w:tcPr>
+            <w:tcW w:type="dxa" w:w="9184"/>
+            <w:vAlign w:val="center"/>
+            <w:tcMar>
+              <w:top w:w="50" w:type="dxa"/>
+              <w:bottom w:w="50" w:type="dxa"/>
+              <w:start w:w="90" w:type="dxa"/>
+              <w:end w:w="90" w:type="dxa"/>
+            </w:tcMar>
+            <w:shd w:fill="F3F7F9"/>
+          </w:tcPr>
+          <w:p>
+            <w:pPr>
+              <w:spacing w:after="0" w:line="240" w:lineRule="auto"/>
+              <w:jc w:val="left"/>
+            </w:pPr>
+            <w:r/>
+            <w:r>
+              <w:rPr>
+                <w:rFonts w:ascii="Microsoft YaHei" w:hAnsi="Microsoft YaHei" w:eastAsia="Microsoft YaHei"/>
+                <w:b w:val="0"/>
+                <w:color w:val="000000"/>
+                <w:sz w:val="17"/>
+              </w:rPr>
+              <w:t>冰雪女王召唤的随从；临时群战个体不可捕捉</w:t>
+            </w:r>
+          </w:p>
+        </w:tc>
+      </w:tr>
+      <w:tr>
+        <w:trPr>
+          <w:cantSplit/>
+        </w:trPr>
+        <w:tc>
+          <w:tcPr>
+            <w:tcW w:type="dxa" w:w="2438"/>
+            <w:vAlign w:val="center"/>
+            <w:tcMar>
+              <w:top w:w="50" w:type="dxa"/>
+              <w:bottom w:w="50" w:type="dxa"/>
+              <w:start w:w="90" w:type="dxa"/>
+              <w:end w:w="90" w:type="dxa"/>
+            </w:tcMar>
+          </w:tcPr>
+          <w:p>
+            <w:pPr>
+              <w:spacing w:after="0" w:line="240" w:lineRule="auto"/>
+              <w:jc w:val="left"/>
+            </w:pPr>
+            <w:r/>
+            <w:r>
+              <w:rPr>
+                <w:rFonts w:ascii="Microsoft YaHei" w:hAnsi="Microsoft YaHei" w:eastAsia="Microsoft YaHei"/>
+                <w:b w:val="0"/>
+                <w:color w:val="000000"/>
+                <w:sz w:val="17"/>
+              </w:rPr>
+              <w:t>烈焰人</w:t>
+            </w:r>
+          </w:p>
+        </w:tc>
+        <w:tc>
+          <w:tcPr>
+            <w:tcW w:type="dxa" w:w="2438"/>
+            <w:vAlign w:val="center"/>
+            <w:tcMar>
+              <w:top w:w="50" w:type="dxa"/>
+              <w:bottom w:w="50" w:type="dxa"/>
+              <w:start w:w="90" w:type="dxa"/>
+              <w:end w:w="90" w:type="dxa"/>
+            </w:tcMar>
+          </w:tcPr>
+          <w:p>
+            <w:pPr>
+              <w:spacing w:after="0" w:line="240" w:lineRule="auto"/>
+              <w:jc w:val="left"/>
+            </w:pPr>
+            <w:r/>
+            <w:r>
+              <w:rPr>
+                <w:rFonts w:ascii="Microsoft YaHei" w:hAnsi="Microsoft YaHei" w:eastAsia="Microsoft YaHei"/>
+                <w:b w:val="0"/>
+                <w:color w:val="000000"/>
+                <w:sz w:val="17"/>
+              </w:rPr>
+              <w:t>烈焰奴仆</w:t>
+            </w:r>
+          </w:p>
+        </w:tc>
+        <w:tc>
+          <w:tcPr>
+            <w:tcW w:type="dxa" w:w="1361"/>
+            <w:vAlign w:val="center"/>
+            <w:tcMar>
+              <w:top w:w="50" w:type="dxa"/>
+              <w:bottom w:w="50" w:type="dxa"/>
+              <w:start w:w="90" w:type="dxa"/>
+              <w:end w:w="90" w:type="dxa"/>
+            </w:tcMar>
+          </w:tcPr>
+          <w:p>
+            <w:pPr>
+              <w:spacing w:after="0" w:line="240" w:lineRule="auto"/>
+              <w:jc w:val="left"/>
+            </w:pPr>
+            <w:r/>
+            <w:r>
+              <w:rPr>
+                <w:rFonts w:ascii="Microsoft YaHei" w:hAnsi="Microsoft YaHei" w:eastAsia="Microsoft YaHei"/>
+                <w:b w:val="0"/>
+                <w:color w:val="000000"/>
+                <w:sz w:val="17"/>
+              </w:rPr>
+              <w:t>30</w:t>
+            </w:r>
+          </w:p>
+        </w:tc>
+        <w:tc>
+          <w:tcPr>
+            <w:tcW w:type="dxa" w:w="9184"/>
+            <w:vAlign w:val="center"/>
+            <w:tcMar>
+              <w:top w:w="50" w:type="dxa"/>
+              <w:bottom w:w="50" w:type="dxa"/>
+              <w:start w:w="90" w:type="dxa"/>
+              <w:end w:w="90" w:type="dxa"/>
+            </w:tcMar>
+          </w:tcPr>
+          <w:p>
+            <w:pPr>
+              <w:spacing w:after="0" w:line="240" w:lineRule="auto"/>
+              <w:jc w:val="left"/>
+            </w:pPr>
+            <w:r/>
+            <w:r>
+              <w:rPr>
+                <w:rFonts w:ascii="Microsoft YaHei" w:hAnsi="Microsoft YaHei" w:eastAsia="Microsoft YaHei"/>
+                <w:b w:val="0"/>
+                <w:color w:val="000000"/>
+                <w:sz w:val="17"/>
+              </w:rPr>
+              <w:t>原作陷阱也可召唤；补充稳定获取路线</w:t>
+            </w:r>
+          </w:p>
+        </w:tc>
+      </w:tr>
+      <w:tr>
+        <w:trPr>
+          <w:cantSplit/>
+        </w:trPr>
+        <w:tc>
+          <w:tcPr>
+            <w:tcW w:type="dxa" w:w="2438"/>
+            <w:vAlign w:val="center"/>
+            <w:tcMar>
+              <w:top w:w="50" w:type="dxa"/>
+              <w:bottom w:w="50" w:type="dxa"/>
+              <w:start w:w="90" w:type="dxa"/>
+              <w:end w:w="90" w:type="dxa"/>
+            </w:tcMar>
+            <w:shd w:fill="F3F7F9"/>
+          </w:tcPr>
+          <w:p>
+            <w:pPr>
+              <w:spacing w:after="0" w:line="240" w:lineRule="auto"/>
+              <w:jc w:val="left"/>
+            </w:pPr>
+            <w:r/>
+            <w:r>
+              <w:rPr>
+                <w:rFonts w:ascii="Microsoft YaHei" w:hAnsi="Microsoft YaHei" w:eastAsia="Microsoft YaHei"/>
+                <w:b w:val="0"/>
+                <w:color w:val="000000"/>
+                <w:sz w:val="17"/>
+              </w:rPr>
+              <w:t>西风啸云</w:t>
+            </w:r>
+          </w:p>
+        </w:tc>
+        <w:tc>
+          <w:tcPr>
+            <w:tcW w:type="dxa" w:w="2438"/>
+            <w:vAlign w:val="center"/>
+            <w:tcMar>
+              <w:top w:w="50" w:type="dxa"/>
+              <w:bottom w:w="50" w:type="dxa"/>
+              <w:start w:w="90" w:type="dxa"/>
+              <w:end w:w="90" w:type="dxa"/>
+            </w:tcMar>
+            <w:shd w:fill="F3F7F9"/>
+          </w:tcPr>
+          <w:p>
+            <w:pPr>
+              <w:spacing w:after="0" w:line="240" w:lineRule="auto"/>
+              <w:jc w:val="left"/>
+            </w:pPr>
+            <w:r/>
+            <w:r>
+              <w:rPr>
+                <w:rFonts w:ascii="Microsoft YaHei" w:hAnsi="Microsoft YaHei" w:eastAsia="Microsoft YaHei"/>
+                <w:b w:val="0"/>
+                <w:color w:val="000000"/>
+                <w:sz w:val="17"/>
+              </w:rPr>
+              <w:t>迷你云护卫</w:t>
+            </w:r>
+          </w:p>
+        </w:tc>
+        <w:tc>
+          <w:tcPr>
+            <w:tcW w:type="dxa" w:w="1361"/>
+            <w:vAlign w:val="center"/>
+            <w:tcMar>
+              <w:top w:w="50" w:type="dxa"/>
+              <w:bottom w:w="50" w:type="dxa"/>
+              <w:start w:w="90" w:type="dxa"/>
+              <w:end w:w="90" w:type="dxa"/>
+            </w:tcMar>
+            <w:shd w:fill="F3F7F9"/>
+          </w:tcPr>
+          <w:p>
+            <w:pPr>
+              <w:spacing w:after="0" w:line="240" w:lineRule="auto"/>
+              <w:jc w:val="left"/>
+            </w:pPr>
+            <w:r/>
+            <w:r>
+              <w:rPr>
+                <w:rFonts w:ascii="Microsoft YaHei" w:hAnsi="Microsoft YaHei" w:eastAsia="Microsoft YaHei"/>
+                <w:b w:val="0"/>
+                <w:color w:val="000000"/>
+                <w:sz w:val="17"/>
+              </w:rPr>
+              <w:t>20</w:t>
+            </w:r>
+          </w:p>
+        </w:tc>
+        <w:tc>
+          <w:tcPr>
+            <w:tcW w:type="dxa" w:w="9184"/>
+            <w:vAlign w:val="center"/>
+            <w:tcMar>
+              <w:top w:w="50" w:type="dxa"/>
+              <w:bottom w:w="50" w:type="dxa"/>
+              <w:start w:w="90" w:type="dxa"/>
+              <w:end w:w="90" w:type="dxa"/>
+            </w:tcMar>
+            <w:shd w:fill="F3F7F9"/>
+          </w:tcPr>
+          <w:p>
+            <w:pPr>
+              <w:spacing w:after="0" w:line="240" w:lineRule="auto"/>
+              <w:jc w:val="left"/>
+            </w:pPr>
+            <w:r/>
+            <w:r>
+              <w:rPr>
+                <w:rFonts w:ascii="Microsoft YaHei" w:hAnsi="Microsoft YaHei" w:eastAsia="Microsoft YaHei"/>
+                <w:b w:val="0"/>
+                <w:color w:val="000000"/>
+                <w:sz w:val="17"/>
+              </w:rPr>
+              <w:t>原作云杖也可召唤；补充脱离召唤物生命周期的获取路线</w:t>
+            </w:r>
+          </w:p>
+        </w:tc>
+      </w:tr>
+      <w:tr>
+        <w:trPr>
+          <w:cantSplit/>
+        </w:trPr>
+        <w:tc>
+          <w:tcPr>
+            <w:tcW w:type="dxa" w:w="2438"/>
+            <w:vAlign w:val="center"/>
+            <w:tcMar>
+              <w:top w:w="50" w:type="dxa"/>
+              <w:bottom w:w="50" w:type="dxa"/>
+              <w:start w:w="90" w:type="dxa"/>
+              <w:end w:w="90" w:type="dxa"/>
+            </w:tcMar>
+          </w:tcPr>
+          <w:p>
+            <w:pPr>
+              <w:spacing w:after="0" w:line="240" w:lineRule="auto"/>
+              <w:jc w:val="left"/>
+            </w:pPr>
+            <w:r/>
+            <w:r>
+              <w:rPr>
+                <w:rFonts w:ascii="Microsoft YaHei" w:hAnsi="Microsoft YaHei" w:eastAsia="Microsoft YaHei"/>
+                <w:b w:val="0"/>
+                <w:color w:val="000000"/>
+                <w:sz w:val="17"/>
+              </w:rPr>
+              <w:t>西风嗤云</w:t>
+            </w:r>
+          </w:p>
+        </w:tc>
+        <w:tc>
+          <w:tcPr>
+            <w:tcW w:type="dxa" w:w="2438"/>
+            <w:vAlign w:val="center"/>
+            <w:tcMar>
+              <w:top w:w="50" w:type="dxa"/>
+              <w:bottom w:w="50" w:type="dxa"/>
+              <w:start w:w="90" w:type="dxa"/>
+              <w:end w:w="90" w:type="dxa"/>
+            </w:tcMar>
+          </w:tcPr>
+          <w:p>
+            <w:pPr>
+              <w:spacing w:after="0" w:line="240" w:lineRule="auto"/>
+              <w:jc w:val="left"/>
+            </w:pPr>
+            <w:r/>
+            <w:r>
+              <w:rPr>
+                <w:rFonts w:ascii="Microsoft YaHei" w:hAnsi="Microsoft YaHei" w:eastAsia="Microsoft YaHei"/>
+                <w:b w:val="0"/>
+                <w:color w:val="000000"/>
+                <w:sz w:val="17"/>
+              </w:rPr>
+              <w:t>和风</w:t>
+            </w:r>
+          </w:p>
+        </w:tc>
+        <w:tc>
+          <w:tcPr>
+            <w:tcW w:type="dxa" w:w="1361"/>
+            <w:vAlign w:val="center"/>
+            <w:tcMar>
+              <w:top w:w="50" w:type="dxa"/>
+              <w:bottom w:w="50" w:type="dxa"/>
+              <w:start w:w="90" w:type="dxa"/>
+              <w:end w:w="90" w:type="dxa"/>
+            </w:tcMar>
+          </w:tcPr>
+          <w:p>
+            <w:pPr>
+              <w:spacing w:after="0" w:line="240" w:lineRule="auto"/>
+              <w:jc w:val="left"/>
+            </w:pPr>
+            <w:r/>
+            <w:r>
+              <w:rPr>
+                <w:rFonts w:ascii="Microsoft YaHei" w:hAnsi="Microsoft YaHei" w:eastAsia="Microsoft YaHei"/>
+                <w:b w:val="0"/>
+                <w:color w:val="000000"/>
+                <w:sz w:val="17"/>
+              </w:rPr>
+              <w:t>15</w:t>
+            </w:r>
+          </w:p>
+        </w:tc>
+        <w:tc>
+          <w:tcPr>
+            <w:tcW w:type="dxa" w:w="9184"/>
+            <w:vAlign w:val="center"/>
+            <w:tcMar>
+              <w:top w:w="50" w:type="dxa"/>
+              <w:bottom w:w="50" w:type="dxa"/>
+              <w:start w:w="90" w:type="dxa"/>
+              <w:end w:w="90" w:type="dxa"/>
+            </w:tcMar>
+          </w:tcPr>
+          <w:p>
+            <w:pPr>
+              <w:spacing w:after="0" w:line="240" w:lineRule="auto"/>
+              <w:jc w:val="left"/>
+            </w:pPr>
+            <w:r/>
+            <w:r>
+              <w:rPr>
+                <w:rFonts w:ascii="Microsoft YaHei" w:hAnsi="Microsoft YaHei" w:eastAsia="Microsoft YaHei"/>
+                <w:b w:val="0"/>
+                <w:color w:val="000000"/>
+                <w:sz w:val="17"/>
+              </w:rPr>
+              <w:t>原作浮空围巾也可召唤；补充脱离召唤物生命周期的获取路线</w:t>
+            </w:r>
+          </w:p>
+        </w:tc>
+      </w:tr>
+      <w:tr>
+        <w:trPr>
+          <w:cantSplit/>
+        </w:trPr>
+        <w:tc>
+          <w:tcPr>
+            <w:tcW w:type="dxa" w:w="2438"/>
+            <w:vAlign w:val="center"/>
+            <w:tcMar>
+              <w:top w:w="50" w:type="dxa"/>
+              <w:bottom w:w="50" w:type="dxa"/>
+              <w:start w:w="90" w:type="dxa"/>
+              <w:end w:w="90" w:type="dxa"/>
+            </w:tcMar>
+            <w:shd w:fill="F3F7F9"/>
+          </w:tcPr>
+          <w:p>
+            <w:pPr>
+              <w:spacing w:after="0" w:line="240" w:lineRule="auto"/>
+              <w:jc w:val="left"/>
+            </w:pPr>
+            <w:r/>
+            <w:r>
+              <w:rPr>
+                <w:rFonts w:ascii="Microsoft YaHei" w:hAnsi="Microsoft YaHei" w:eastAsia="Microsoft YaHei"/>
+                <w:b w:val="0"/>
+                <w:color w:val="000000"/>
+                <w:sz w:val="17"/>
+              </w:rPr>
+              <w:t>唤魔者</w:t>
+            </w:r>
+          </w:p>
+        </w:tc>
+        <w:tc>
+          <w:tcPr>
+            <w:tcW w:type="dxa" w:w="2438"/>
+            <w:vAlign w:val="center"/>
+            <w:tcMar>
+              <w:top w:w="50" w:type="dxa"/>
+              <w:bottom w:w="50" w:type="dxa"/>
+              <w:start w:w="90" w:type="dxa"/>
+              <w:end w:w="90" w:type="dxa"/>
+            </w:tcMar>
+            <w:shd w:fill="F3F7F9"/>
+          </w:tcPr>
+          <w:p>
+            <w:pPr>
+              <w:spacing w:after="0" w:line="240" w:lineRule="auto"/>
+              <w:jc w:val="left"/>
+            </w:pPr>
+            <w:r/>
+            <w:r>
+              <w:rPr>
+                <w:rFonts w:ascii="Microsoft YaHei" w:hAnsi="Microsoft YaHei" w:eastAsia="Microsoft YaHei"/>
+                <w:b w:val="0"/>
+                <w:color w:val="000000"/>
+                <w:sz w:val="17"/>
+              </w:rPr>
+              <w:t>手下</w:t>
+            </w:r>
+          </w:p>
+        </w:tc>
+        <w:tc>
+          <w:tcPr>
+            <w:tcW w:type="dxa" w:w="1361"/>
+            <w:vAlign w:val="center"/>
+            <w:tcMar>
+              <w:top w:w="50" w:type="dxa"/>
+              <w:bottom w:w="50" w:type="dxa"/>
+              <w:start w:w="90" w:type="dxa"/>
+              <w:end w:w="90" w:type="dxa"/>
+            </w:tcMar>
+            <w:shd w:fill="F3F7F9"/>
+          </w:tcPr>
+          <w:p>
+            <w:pPr>
+              <w:spacing w:after="0" w:line="240" w:lineRule="auto"/>
+              <w:jc w:val="left"/>
+            </w:pPr>
+            <w:r/>
+            <w:r>
+              <w:rPr>
+                <w:rFonts w:ascii="Microsoft YaHei" w:hAnsi="Microsoft YaHei" w:eastAsia="Microsoft YaHei"/>
+                <w:b w:val="0"/>
+                <w:color w:val="000000"/>
+                <w:sz w:val="17"/>
+              </w:rPr>
+              <w:t>35</w:t>
+            </w:r>
+          </w:p>
+        </w:tc>
+        <w:tc>
+          <w:tcPr>
+            <w:tcW w:type="dxa" w:w="9184"/>
+            <w:vAlign w:val="center"/>
+            <w:tcMar>
+              <w:top w:w="50" w:type="dxa"/>
+              <w:bottom w:w="50" w:type="dxa"/>
+              <w:start w:w="90" w:type="dxa"/>
+              <w:end w:w="90" w:type="dxa"/>
+            </w:tcMar>
+            <w:shd w:fill="F3F7F9"/>
+          </w:tcPr>
+          <w:p>
+            <w:pPr>
+              <w:spacing w:after="0" w:line="240" w:lineRule="auto"/>
+              <w:jc w:val="left"/>
+            </w:pPr>
+            <w:r/>
+            <w:r>
+              <w:rPr>
+                <w:rFonts w:ascii="Microsoft YaHei" w:hAnsi="Microsoft YaHei" w:eastAsia="Microsoft YaHei"/>
+                <w:b w:val="0"/>
+                <w:color w:val="000000"/>
+                <w:sz w:val="17"/>
+              </w:rPr>
+              <w:t>当前来源版本仅发现刷怪蛋入口，未发现生存生成或合成入口</w:t>
+            </w:r>
+          </w:p>
+        </w:tc>
+      </w:tr>
+    </w:tbl>
+    <w:p>
+      <w:pPr>
+        <w:pStyle w:val="Heading1"/>
+      </w:pPr>
+      <w:r>
         <w:t>暮色森林  58 种</w:t>
       </w:r>
     </w:p>
@@ -115,7 +2208,7 @@
         </w:trPr>
         <w:tc>
           <w:tcPr>
-            <w:tcW w:type="dxa" w:w="2617"/>
+            <w:tcW w:type="dxa" w:w="2778"/>
             <w:vAlign w:val="center"/>
             <w:shd w:fill="27566F"/>
             <w:tcMar>
@@ -127,6 +2220,7 @@
           </w:tcPr>
           <w:p>
             <w:pPr>
+              <w:keepNext/>
               <w:spacing w:after="0" w:line="240" w:lineRule="auto"/>
               <w:jc w:val="center"/>
             </w:pPr>
@@ -151,7 +2245,7 @@
         </w:tc>
         <w:tc>
           <w:tcPr>
-            <w:tcW w:type="dxa" w:w="2617"/>
+            <w:tcW w:type="dxa" w:w="2778"/>
             <w:vAlign w:val="center"/>
             <w:shd w:fill="27566F"/>
             <w:tcMar>
@@ -163,6 +2257,7 @@
           </w:tcPr>
           <w:p>
             <w:pPr>
+              <w:keepNext/>
               <w:spacing w:after="0" w:line="240" w:lineRule="auto"/>
               <w:jc w:val="center"/>
             </w:pPr>
@@ -187,7 +2282,7 @@
         </w:tc>
         <w:tc>
           <w:tcPr>
-            <w:tcW w:type="dxa" w:w="2617"/>
+            <w:tcW w:type="dxa" w:w="1644"/>
             <w:vAlign w:val="center"/>
             <w:shd w:fill="27566F"/>
             <w:tcMar>
@@ -199,6 +2294,7 @@
           </w:tcPr>
           <w:p>
             <w:pPr>
+              <w:keepNext/>
               <w:spacing w:after="0" w:line="240" w:lineRule="auto"/>
               <w:jc w:val="center"/>
             </w:pPr>
@@ -223,7 +2319,7 @@
         </w:tc>
         <w:tc>
           <w:tcPr>
-            <w:tcW w:type="dxa" w:w="2617"/>
+            <w:tcW w:type="dxa" w:w="3005"/>
             <w:vAlign w:val="center"/>
             <w:shd w:fill="27566F"/>
             <w:tcMar>
@@ -235,6 +2331,7 @@
           </w:tcPr>
           <w:p>
             <w:pPr>
+              <w:keepNext/>
               <w:spacing w:after="0" w:line="240" w:lineRule="auto"/>
               <w:jc w:val="center"/>
             </w:pPr>
@@ -259,7 +2356,7 @@
         </w:tc>
         <w:tc>
           <w:tcPr>
-            <w:tcW w:type="dxa" w:w="2617"/>
+            <w:tcW w:type="dxa" w:w="3061"/>
             <w:vAlign w:val="center"/>
             <w:shd w:fill="27566F"/>
             <w:tcMar>
@@ -271,6 +2368,7 @@
           </w:tcPr>
           <w:p>
             <w:pPr>
+              <w:keepNext/>
               <w:spacing w:after="0" w:line="240" w:lineRule="auto"/>
               <w:jc w:val="center"/>
             </w:pPr>
@@ -297,7 +2395,7 @@
         </w:tc>
         <w:tc>
           <w:tcPr>
-            <w:tcW w:type="dxa" w:w="2617"/>
+            <w:tcW w:type="dxa" w:w="2154"/>
             <w:vAlign w:val="center"/>
             <w:shd w:fill="27566F"/>
             <w:tcMar>
@@ -309,6 +2407,7 @@
           </w:tcPr>
           <w:p>
             <w:pPr>
+              <w:keepNext/>
               <w:spacing w:after="0" w:line="240" w:lineRule="auto"/>
               <w:jc w:val="center"/>
             </w:pPr>
@@ -14180,7 +16279,7 @@
         </w:trPr>
         <w:tc>
           <w:tcPr>
-            <w:tcW w:type="dxa" w:w="2617"/>
+            <w:tcW w:type="dxa" w:w="2778"/>
             <w:vAlign w:val="center"/>
             <w:shd w:fill="27566F"/>
             <w:tcMar>
@@ -14192,6 +16291,7 @@
           </w:tcPr>
           <w:p>
             <w:pPr>
+              <w:keepNext/>
               <w:spacing w:after="0" w:line="240" w:lineRule="auto"/>
               <w:jc w:val="center"/>
             </w:pPr>
@@ -14216,7 +16316,7 @@
         </w:tc>
         <w:tc>
           <w:tcPr>
-            <w:tcW w:type="dxa" w:w="2617"/>
+            <w:tcW w:type="dxa" w:w="2778"/>
             <w:vAlign w:val="center"/>
             <w:shd w:fill="27566F"/>
             <w:tcMar>
@@ -14228,6 +16328,7 @@
           </w:tcPr>
           <w:p>
             <w:pPr>
+              <w:keepNext/>
               <w:spacing w:after="0" w:line="240" w:lineRule="auto"/>
               <w:jc w:val="center"/>
             </w:pPr>
@@ -14252,7 +16353,7 @@
         </w:tc>
         <w:tc>
           <w:tcPr>
-            <w:tcW w:type="dxa" w:w="2617"/>
+            <w:tcW w:type="dxa" w:w="1644"/>
             <w:vAlign w:val="center"/>
             <w:shd w:fill="27566F"/>
             <w:tcMar>
@@ -14264,6 +16365,7 @@
           </w:tcPr>
           <w:p>
             <w:pPr>
+              <w:keepNext/>
               <w:spacing w:after="0" w:line="240" w:lineRule="auto"/>
               <w:jc w:val="center"/>
             </w:pPr>
@@ -14288,7 +16390,7 @@
         </w:tc>
         <w:tc>
           <w:tcPr>
-            <w:tcW w:type="dxa" w:w="2617"/>
+            <w:tcW w:type="dxa" w:w="3005"/>
             <w:vAlign w:val="center"/>
             <w:shd w:fill="27566F"/>
             <w:tcMar>
@@ -14300,6 +16402,7 @@
           </w:tcPr>
           <w:p>
             <w:pPr>
+              <w:keepNext/>
               <w:spacing w:after="0" w:line="240" w:lineRule="auto"/>
               <w:jc w:val="center"/>
             </w:pPr>
@@ -14324,7 +16427,7 @@
         </w:tc>
         <w:tc>
           <w:tcPr>
-            <w:tcW w:type="dxa" w:w="2617"/>
+            <w:tcW w:type="dxa" w:w="3061"/>
             <w:vAlign w:val="center"/>
             <w:shd w:fill="27566F"/>
             <w:tcMar>
@@ -14336,6 +16439,7 @@
           </w:tcPr>
           <w:p>
             <w:pPr>
+              <w:keepNext/>
               <w:spacing w:after="0" w:line="240" w:lineRule="auto"/>
               <w:jc w:val="center"/>
             </w:pPr>
@@ -14362,7 +16466,7 @@
         </w:tc>
         <w:tc>
           <w:tcPr>
-            <w:tcW w:type="dxa" w:w="2617"/>
+            <w:tcW w:type="dxa" w:w="2154"/>
             <w:vAlign w:val="center"/>
             <w:shd w:fill="27566F"/>
             <w:tcMar>
@@ -14374,6 +16478,7 @@
           </w:tcPr>
           <w:p>
             <w:pPr>
+              <w:keepNext/>
               <w:spacing w:after="0" w:line="240" w:lineRule="auto"/>
               <w:jc w:val="center"/>
             </w:pPr>
@@ -14676,7 +16781,7 @@
         </w:trPr>
         <w:tc>
           <w:tcPr>
-            <w:tcW w:type="dxa" w:w="2617"/>
+            <w:tcW w:type="dxa" w:w="2778"/>
             <w:vAlign w:val="center"/>
             <w:shd w:fill="27566F"/>
             <w:tcMar>
@@ -14688,6 +16793,7 @@
           </w:tcPr>
           <w:p>
             <w:pPr>
+              <w:keepNext/>
               <w:spacing w:after="0" w:line="240" w:lineRule="auto"/>
               <w:jc w:val="center"/>
             </w:pPr>
@@ -14712,7 +16818,7 @@
         </w:tc>
         <w:tc>
           <w:tcPr>
-            <w:tcW w:type="dxa" w:w="2617"/>
+            <w:tcW w:type="dxa" w:w="2778"/>
             <w:vAlign w:val="center"/>
             <w:shd w:fill="27566F"/>
             <w:tcMar>
@@ -14724,6 +16830,7 @@
           </w:tcPr>
           <w:p>
             <w:pPr>
+              <w:keepNext/>
               <w:spacing w:after="0" w:line="240" w:lineRule="auto"/>
               <w:jc w:val="center"/>
             </w:pPr>
@@ -14748,7 +16855,7 @@
         </w:tc>
         <w:tc>
           <w:tcPr>
-            <w:tcW w:type="dxa" w:w="2617"/>
+            <w:tcW w:type="dxa" w:w="1644"/>
             <w:vAlign w:val="center"/>
             <w:shd w:fill="27566F"/>
             <w:tcMar>
@@ -14760,6 +16867,7 @@
           </w:tcPr>
           <w:p>
             <w:pPr>
+              <w:keepNext/>
               <w:spacing w:after="0" w:line="240" w:lineRule="auto"/>
               <w:jc w:val="center"/>
             </w:pPr>
@@ -14784,7 +16892,7 @@
         </w:tc>
         <w:tc>
           <w:tcPr>
-            <w:tcW w:type="dxa" w:w="2617"/>
+            <w:tcW w:type="dxa" w:w="3005"/>
             <w:vAlign w:val="center"/>
             <w:shd w:fill="27566F"/>
             <w:tcMar>
@@ -14796,6 +16904,7 @@
           </w:tcPr>
           <w:p>
             <w:pPr>
+              <w:keepNext/>
               <w:spacing w:after="0" w:line="240" w:lineRule="auto"/>
               <w:jc w:val="center"/>
             </w:pPr>
@@ -14820,7 +16929,7 @@
         </w:tc>
         <w:tc>
           <w:tcPr>
-            <w:tcW w:type="dxa" w:w="2617"/>
+            <w:tcW w:type="dxa" w:w="3061"/>
             <w:vAlign w:val="center"/>
             <w:shd w:fill="27566F"/>
             <w:tcMar>
@@ -14832,6 +16941,7 @@
           </w:tcPr>
           <w:p>
             <w:pPr>
+              <w:keepNext/>
               <w:spacing w:after="0" w:line="240" w:lineRule="auto"/>
               <w:jc w:val="center"/>
             </w:pPr>
@@ -14858,7 +16968,7 @@
         </w:tc>
         <w:tc>
           <w:tcPr>
-            <w:tcW w:type="dxa" w:w="2617"/>
+            <w:tcW w:type="dxa" w:w="2154"/>
             <w:vAlign w:val="center"/>
             <w:shd w:fill="27566F"/>
             <w:tcMar>
@@ -14870,6 +16980,7 @@
           </w:tcPr>
           <w:p>
             <w:pPr>
+              <w:keepNext/>
               <w:spacing w:after="0" w:line="240" w:lineRule="auto"/>
               <w:jc w:val="center"/>
             </w:pPr>
@@ -19932,7 +22043,7 @@
         </w:trPr>
         <w:tc>
           <w:tcPr>
-            <w:tcW w:type="dxa" w:w="2617"/>
+            <w:tcW w:type="dxa" w:w="2778"/>
             <w:vAlign w:val="center"/>
             <w:shd w:fill="27566F"/>
             <w:tcMar>
@@ -19944,6 +22055,7 @@
           </w:tcPr>
           <w:p>
             <w:pPr>
+              <w:keepNext/>
               <w:spacing w:after="0" w:line="240" w:lineRule="auto"/>
               <w:jc w:val="center"/>
             </w:pPr>
@@ -19968,7 +22080,7 @@
         </w:tc>
         <w:tc>
           <w:tcPr>
-            <w:tcW w:type="dxa" w:w="2617"/>
+            <w:tcW w:type="dxa" w:w="2778"/>
             <w:vAlign w:val="center"/>
             <w:shd w:fill="27566F"/>
             <w:tcMar>
@@ -19980,6 +22092,7 @@
           </w:tcPr>
           <w:p>
             <w:pPr>
+              <w:keepNext/>
               <w:spacing w:after="0" w:line="240" w:lineRule="auto"/>
               <w:jc w:val="center"/>
             </w:pPr>
@@ -20004,7 +22117,7 @@
         </w:tc>
         <w:tc>
           <w:tcPr>
-            <w:tcW w:type="dxa" w:w="2617"/>
+            <w:tcW w:type="dxa" w:w="1644"/>
             <w:vAlign w:val="center"/>
             <w:shd w:fill="27566F"/>
             <w:tcMar>
@@ -20016,6 +22129,7 @@
           </w:tcPr>
           <w:p>
             <w:pPr>
+              <w:keepNext/>
               <w:spacing w:after="0" w:line="240" w:lineRule="auto"/>
               <w:jc w:val="center"/>
             </w:pPr>
@@ -20040,7 +22154,7 @@
         </w:tc>
         <w:tc>
           <w:tcPr>
-            <w:tcW w:type="dxa" w:w="2617"/>
+            <w:tcW w:type="dxa" w:w="3005"/>
             <w:vAlign w:val="center"/>
             <w:shd w:fill="27566F"/>
             <w:tcMar>
@@ -20052,6 +22166,7 @@
           </w:tcPr>
           <w:p>
             <w:pPr>
+              <w:keepNext/>
               <w:spacing w:after="0" w:line="240" w:lineRule="auto"/>
               <w:jc w:val="center"/>
             </w:pPr>
@@ -20076,7 +22191,7 @@
         </w:tc>
         <w:tc>
           <w:tcPr>
-            <w:tcW w:type="dxa" w:w="2617"/>
+            <w:tcW w:type="dxa" w:w="3061"/>
             <w:vAlign w:val="center"/>
             <w:shd w:fill="27566F"/>
             <w:tcMar>
@@ -20088,6 +22203,7 @@
           </w:tcPr>
           <w:p>
             <w:pPr>
+              <w:keepNext/>
               <w:spacing w:after="0" w:line="240" w:lineRule="auto"/>
               <w:jc w:val="center"/>
             </w:pPr>
@@ -20114,7 +22230,7 @@
         </w:tc>
         <w:tc>
           <w:tcPr>
-            <w:tcW w:type="dxa" w:w="2617"/>
+            <w:tcW w:type="dxa" w:w="2154"/>
             <w:vAlign w:val="center"/>
             <w:shd w:fill="27566F"/>
             <w:tcMar>
@@ -20126,6 +22242,7 @@
           </w:tcPr>
           <w:p>
             <w:pPr>
+              <w:keepNext/>
               <w:spacing w:after="0" w:line="240" w:lineRule="auto"/>
               <w:jc w:val="center"/>
             </w:pPr>
@@ -21856,7 +23973,7 @@
         </w:trPr>
         <w:tc>
           <w:tcPr>
-            <w:tcW w:type="dxa" w:w="2617"/>
+            <w:tcW w:type="dxa" w:w="2778"/>
             <w:vAlign w:val="center"/>
             <w:shd w:fill="27566F"/>
             <w:tcMar>
@@ -21868,6 +23985,7 @@
           </w:tcPr>
           <w:p>
             <w:pPr>
+              <w:keepNext/>
               <w:spacing w:after="0" w:line="240" w:lineRule="auto"/>
               <w:jc w:val="center"/>
             </w:pPr>
@@ -21892,7 +24010,7 @@
         </w:tc>
         <w:tc>
           <w:tcPr>
-            <w:tcW w:type="dxa" w:w="2617"/>
+            <w:tcW w:type="dxa" w:w="2778"/>
             <w:vAlign w:val="center"/>
             <w:shd w:fill="27566F"/>
             <w:tcMar>
@@ -21904,6 +24022,7 @@
           </w:tcPr>
           <w:p>
             <w:pPr>
+              <w:keepNext/>
               <w:spacing w:after="0" w:line="240" w:lineRule="auto"/>
               <w:jc w:val="center"/>
             </w:pPr>
@@ -21928,7 +24047,7 @@
         </w:tc>
         <w:tc>
           <w:tcPr>
-            <w:tcW w:type="dxa" w:w="2617"/>
+            <w:tcW w:type="dxa" w:w="1644"/>
             <w:vAlign w:val="center"/>
             <w:shd w:fill="27566F"/>
             <w:tcMar>
@@ -21940,6 +24059,7 @@
           </w:tcPr>
           <w:p>
             <w:pPr>
+              <w:keepNext/>
               <w:spacing w:after="0" w:line="240" w:lineRule="auto"/>
               <w:jc w:val="center"/>
             </w:pPr>
@@ -21964,7 +24084,7 @@
         </w:tc>
         <w:tc>
           <w:tcPr>
-            <w:tcW w:type="dxa" w:w="2617"/>
+            <w:tcW w:type="dxa" w:w="3005"/>
             <w:vAlign w:val="center"/>
             <w:shd w:fill="27566F"/>
             <w:tcMar>
@@ -21976,6 +24096,7 @@
           </w:tcPr>
           <w:p>
             <w:pPr>
+              <w:keepNext/>
               <w:spacing w:after="0" w:line="240" w:lineRule="auto"/>
               <w:jc w:val="center"/>
             </w:pPr>
@@ -22000,7 +24121,7 @@
         </w:tc>
         <w:tc>
           <w:tcPr>
-            <w:tcW w:type="dxa" w:w="2617"/>
+            <w:tcW w:type="dxa" w:w="3061"/>
             <w:vAlign w:val="center"/>
             <w:shd w:fill="27566F"/>
             <w:tcMar>
@@ -22012,6 +24133,7 @@
           </w:tcPr>
           <w:p>
             <w:pPr>
+              <w:keepNext/>
               <w:spacing w:after="0" w:line="240" w:lineRule="auto"/>
               <w:jc w:val="center"/>
             </w:pPr>
@@ -22038,7 +24160,7 @@
         </w:tc>
         <w:tc>
           <w:tcPr>
-            <w:tcW w:type="dxa" w:w="2617"/>
+            <w:tcW w:type="dxa" w:w="2154"/>
             <w:vAlign w:val="center"/>
             <w:shd w:fill="27566F"/>
             <w:tcMar>
@@ -22050,6 +24172,7 @@
           </w:tcPr>
           <w:p>
             <w:pPr>
+              <w:keepNext/>
               <w:spacing w:after="0" w:line="240" w:lineRule="auto"/>
               <w:jc w:val="center"/>
             </w:pPr>
@@ -22593,7 +24716,7 @@
         </w:trPr>
         <w:tc>
           <w:tcPr>
-            <w:tcW w:type="dxa" w:w="2617"/>
+            <w:tcW w:type="dxa" w:w="2778"/>
             <w:vAlign w:val="center"/>
             <w:shd w:fill="27566F"/>
             <w:tcMar>
@@ -22605,6 +24728,7 @@
           </w:tcPr>
           <w:p>
             <w:pPr>
+              <w:keepNext/>
               <w:spacing w:after="0" w:line="240" w:lineRule="auto"/>
               <w:jc w:val="center"/>
             </w:pPr>
@@ -22629,7 +24753,7 @@
         </w:tc>
         <w:tc>
           <w:tcPr>
-            <w:tcW w:type="dxa" w:w="2617"/>
+            <w:tcW w:type="dxa" w:w="2778"/>
             <w:vAlign w:val="center"/>
             <w:shd w:fill="27566F"/>
             <w:tcMar>
@@ -22641,6 +24765,7 @@
           </w:tcPr>
           <w:p>
             <w:pPr>
+              <w:keepNext/>
               <w:spacing w:after="0" w:line="240" w:lineRule="auto"/>
               <w:jc w:val="center"/>
             </w:pPr>
@@ -22665,7 +24790,7 @@
         </w:tc>
         <w:tc>
           <w:tcPr>
-            <w:tcW w:type="dxa" w:w="2617"/>
+            <w:tcW w:type="dxa" w:w="1644"/>
             <w:vAlign w:val="center"/>
             <w:shd w:fill="27566F"/>
             <w:tcMar>
@@ -22677,6 +24802,7 @@
           </w:tcPr>
           <w:p>
             <w:pPr>
+              <w:keepNext/>
               <w:spacing w:after="0" w:line="240" w:lineRule="auto"/>
               <w:jc w:val="center"/>
             </w:pPr>
@@ -22701,7 +24827,7 @@
         </w:tc>
         <w:tc>
           <w:tcPr>
-            <w:tcW w:type="dxa" w:w="2617"/>
+            <w:tcW w:type="dxa" w:w="3005"/>
             <w:vAlign w:val="center"/>
             <w:shd w:fill="27566F"/>
             <w:tcMar>
@@ -22713,6 +24839,7 @@
           </w:tcPr>
           <w:p>
             <w:pPr>
+              <w:keepNext/>
               <w:spacing w:after="0" w:line="240" w:lineRule="auto"/>
               <w:jc w:val="center"/>
             </w:pPr>
@@ -22737,7 +24864,7 @@
         </w:tc>
         <w:tc>
           <w:tcPr>
-            <w:tcW w:type="dxa" w:w="2617"/>
+            <w:tcW w:type="dxa" w:w="3061"/>
             <w:vAlign w:val="center"/>
             <w:shd w:fill="27566F"/>
             <w:tcMar>
@@ -22749,6 +24876,7 @@
           </w:tcPr>
           <w:p>
             <w:pPr>
+              <w:keepNext/>
               <w:spacing w:after="0" w:line="240" w:lineRule="auto"/>
               <w:jc w:val="center"/>
             </w:pPr>
@@ -22775,7 +24903,7 @@
         </w:tc>
         <w:tc>
           <w:tcPr>
-            <w:tcW w:type="dxa" w:w="2617"/>
+            <w:tcW w:type="dxa" w:w="2154"/>
             <w:vAlign w:val="center"/>
             <w:shd w:fill="27566F"/>
             <w:tcMar>
@@ -22787,6 +24915,7 @@
           </w:tcPr>
           <w:p>
             <w:pPr>
+              <w:keepNext/>
               <w:spacing w:after="0" w:line="240" w:lineRule="auto"/>
               <w:jc w:val="center"/>
             </w:pPr>
@@ -23091,7 +25220,7 @@
         </w:trPr>
         <w:tc>
           <w:tcPr>
-            <w:tcW w:type="dxa" w:w="3926"/>
+            <w:tcW w:type="dxa" w:w="2268"/>
             <w:vAlign w:val="center"/>
             <w:tcMar>
               <w:top w:w="90" w:type="dxa"/>
@@ -23127,7 +25256,7 @@
         </w:tc>
         <w:tc>
           <w:tcPr>
-            <w:tcW w:type="dxa" w:w="3926"/>
+            <w:tcW w:type="dxa" w:w="2835"/>
             <w:vAlign w:val="center"/>
             <w:tcMar>
               <w:top w:w="90" w:type="dxa"/>
@@ -23163,7 +25292,7 @@
         </w:tc>
         <w:tc>
           <w:tcPr>
-            <w:tcW w:type="dxa" w:w="3926"/>
+            <w:tcW w:type="dxa" w:w="3402"/>
             <w:vAlign w:val="center"/>
             <w:tcMar>
               <w:top w:w="90" w:type="dxa"/>
@@ -23199,7 +25328,7 @@
         </w:tc>
         <w:tc>
           <w:tcPr>
-            <w:tcW w:type="dxa" w:w="3926"/>
+            <w:tcW w:type="dxa" w:w="6917"/>
             <w:vAlign w:val="center"/>
             <w:tcMar>
               <w:top w:w="90" w:type="dxa"/>

</xml_diff>